<commit_message>
finishing VGSync fork stuff
</commit_message>
<xml_diff>
--- a/doc/Documentation.docx
+++ b/doc/Documentation.docx
@@ -79,6 +79,7 @@
           </wp:anchor>
         </w:drawing>
       </w:r>
+      <w:proofErr w:type="spellStart"/>
       <w:r>
         <w:rPr>
           <w:b/>
@@ -89,6 +90,7 @@
         </w:rPr>
         <w:t>VGSync</w:t>
       </w:r>
+      <w:proofErr w:type="spellEnd"/>
       <w:r>
         <w:rPr>
           <w:b/>
@@ -146,6 +148,7 @@
         </w:rPr>
         <w:br/>
       </w:r>
+      <w:proofErr w:type="spellStart"/>
       <w:r>
         <w:rPr>
           <w:b/>
@@ -158,6 +161,7 @@
         </w:rPr>
         <w:t>VGSync</w:t>
       </w:r>
+      <w:proofErr w:type="spellEnd"/>
       <w:r>
         <w:rPr>
           <w:i/>
@@ -178,17 +182,65 @@
           <w:szCs w:val="24"/>
           <w:lang w:val="en-GB"/>
         </w:rPr>
-        <w:t>“Kinomap Video Route Suite”</w:t>
-      </w:r>
-      <w:r>
-        <w:rPr>
+        <w:t>“</w:t>
+      </w:r>
+      <w:proofErr w:type="spellStart"/>
+      <w:r>
+        <w:rPr>
+          <w:b/>
+          <w:bCs/>
           <w:i/>
           <w:iCs/>
           <w:sz w:val="24"/>
           <w:szCs w:val="24"/>
           <w:lang w:val="en-GB"/>
         </w:rPr>
-        <w:t xml:space="preserve"> — an open-source tool to synchronize videos with GPX/FIT data (officially supported by Kinomap).</w:t>
+        <w:t>Kinomap</w:t>
+      </w:r>
+      <w:proofErr w:type="spellEnd"/>
+      <w:r>
+        <w:rPr>
+          <w:b/>
+          <w:bCs/>
+          <w:i/>
+          <w:iCs/>
+          <w:sz w:val="24"/>
+          <w:szCs w:val="24"/>
+          <w:lang w:val="en-GB"/>
+        </w:rPr>
+        <w:t xml:space="preserve"> Video Route Suite”</w:t>
+      </w:r>
+      <w:r>
+        <w:rPr>
+          <w:i/>
+          <w:iCs/>
+          <w:sz w:val="24"/>
+          <w:szCs w:val="24"/>
+          <w:lang w:val="en-GB"/>
+        </w:rPr>
+        <w:t xml:space="preserve"> — an open-source tool to synchronize videos with GPX/FIT data (officially supported by </w:t>
+      </w:r>
+      <w:proofErr w:type="spellStart"/>
+      <w:r>
+        <w:rPr>
+          <w:i/>
+          <w:iCs/>
+          <w:sz w:val="24"/>
+          <w:szCs w:val="24"/>
+          <w:lang w:val="en-GB"/>
+        </w:rPr>
+        <w:t>Kinomap</w:t>
+      </w:r>
+      <w:proofErr w:type="spellEnd"/>
+      <w:r>
+        <w:rPr>
+          <w:i/>
+          <w:iCs/>
+          <w:sz w:val="24"/>
+          <w:szCs w:val="24"/>
+          <w:lang w:val="en-GB"/>
+        </w:rPr>
+        <w:t>).</w:t>
       </w:r>
     </w:p>
     <w:p>
@@ -223,17 +275,33 @@
           <w:lang w:val="en-GB"/>
         </w:rPr>
       </w:pPr>
+      <w:proofErr w:type="spellStart"/>
       <w:r>
         <w:rPr>
           <w:lang w:val="en-GB"/>
         </w:rPr>
         <w:t>VGSync</w:t>
       </w:r>
-      <w:r>
-        <w:rPr>
-          <w:lang w:val="en-GB"/>
-        </w:rPr>
-        <w:t xml:space="preserve"> aligns your video with GPX/FIT data so each frame corresponds precisely to its position on the map, making uploads to Kinomap seamless.</w:t>
+      <w:proofErr w:type="spellEnd"/>
+      <w:r>
+        <w:rPr>
+          <w:lang w:val="en-GB"/>
+        </w:rPr>
+        <w:t xml:space="preserve"> aligns your video with GPX/FIT data so each frame corresponds precisely to its position on the map, making uploads to </w:t>
+      </w:r>
+      <w:proofErr w:type="spellStart"/>
+      <w:r>
+        <w:rPr>
+          <w:lang w:val="en-GB"/>
+        </w:rPr>
+        <w:t>Kinomap</w:t>
+      </w:r>
+      <w:proofErr w:type="spellEnd"/>
+      <w:r>
+        <w:rPr>
+          <w:lang w:val="en-GB"/>
+        </w:rPr>
+        <w:t xml:space="preserve"> seamless.</w:t>
       </w:r>
     </w:p>
     <w:p>
@@ -258,7 +326,49 @@
         <w:rPr>
           <w:lang w:val="en-GB"/>
         </w:rPr>
-        <w:t xml:space="preserve"> file are imported the application asks if the video start is already synchronized with gpx start. If it’s not the case it is advised to start by finding a matching gpx and video location. It can be anywhere in the video, not especially at the start. Until this synchronization is not done, video and gpx edit and playback are not synchronized.</w:t>
+        <w:t xml:space="preserve"> file are imported the application asks if the video start is already synchronized with </w:t>
+      </w:r>
+      <w:proofErr w:type="spellStart"/>
+      <w:r>
+        <w:rPr>
+          <w:lang w:val="en-GB"/>
+        </w:rPr>
+        <w:t>gpx</w:t>
+      </w:r>
+      <w:proofErr w:type="spellEnd"/>
+      <w:r>
+        <w:rPr>
+          <w:lang w:val="en-GB"/>
+        </w:rPr>
+        <w:t xml:space="preserve"> start. If it’s not the case it is advised to start by finding a matching </w:t>
+      </w:r>
+      <w:proofErr w:type="spellStart"/>
+      <w:r>
+        <w:rPr>
+          <w:lang w:val="en-GB"/>
+        </w:rPr>
+        <w:t>gpx</w:t>
+      </w:r>
+      <w:proofErr w:type="spellEnd"/>
+      <w:r>
+        <w:rPr>
+          <w:lang w:val="en-GB"/>
+        </w:rPr>
+        <w:t xml:space="preserve"> and video location. It can be anywhere in the video, not especially at the start. Until this synchronization is not done, video and </w:t>
+      </w:r>
+      <w:proofErr w:type="spellStart"/>
+      <w:r>
+        <w:rPr>
+          <w:lang w:val="en-GB"/>
+        </w:rPr>
+        <w:t>gpx</w:t>
+      </w:r>
+      <w:proofErr w:type="spellEnd"/>
+      <w:r>
+        <w:rPr>
+          <w:lang w:val="en-GB"/>
+        </w:rPr>
+        <w:t xml:space="preserve"> edit and playback are not synchronized.</w:t>
       </w:r>
     </w:p>
     <w:p>
@@ -320,12 +430,14 @@
         </w:rPr>
         <w:t xml:space="preserve">This is the default setting, where a pre-cut video (edited outside of </w:t>
       </w:r>
+      <w:proofErr w:type="spellStart"/>
       <w:r>
         <w:rPr>
           <w:lang w:val="en-GB"/>
         </w:rPr>
         <w:t>VGSync</w:t>
       </w:r>
+      <w:proofErr w:type="spellEnd"/>
       <w:r>
         <w:rPr>
           <w:lang w:val="en-GB"/>
@@ -497,8 +609,16 @@
         <w:rPr>
           <w:lang w:val="en-GB"/>
         </w:rPr>
-        <w:t>Save as: GPX or Virb</w:t>
-      </w:r>
+        <w:t xml:space="preserve">Save as: GPX or </w:t>
+      </w:r>
+      <w:proofErr w:type="spellStart"/>
+      <w:r>
+        <w:rPr>
+          <w:lang w:val="en-GB"/>
+        </w:rPr>
+        <w:t>Virb</w:t>
+      </w:r>
+      <w:proofErr w:type="spellEnd"/>
     </w:p>
     <w:p>
       <w:pPr>
@@ -566,7 +686,21 @@
           <w:lang w:val="en-GB"/>
         </w:rPr>
         <w:br/>
-        <w:t xml:space="preserve">but instead handled by LossLessCut – meaning it is simply </w:t>
+        <w:t xml:space="preserve">but instead handled by </w:t>
+      </w:r>
+      <w:proofErr w:type="spellStart"/>
+      <w:r>
+        <w:rPr>
+          <w:lang w:val="en-GB"/>
+        </w:rPr>
+        <w:t>LossLessCut</w:t>
+      </w:r>
+      <w:proofErr w:type="spellEnd"/>
+      <w:r>
+        <w:rPr>
+          <w:lang w:val="en-GB"/>
+        </w:rPr>
+        <w:t xml:space="preserve"> – meaning it is simply </w:t>
       </w:r>
       <w:r>
         <w:rPr>
@@ -628,7 +762,21 @@
           <w:lang w:val="en-GB"/>
         </w:rPr>
         <w:br/>
-        <w:t>Cuts will also be transitioned smoothly using a crossfade (xfade) effect.</w:t>
+        <w:t>Cuts will also be transitioned smoothly using a crossfade (</w:t>
+      </w:r>
+      <w:proofErr w:type="spellStart"/>
+      <w:r>
+        <w:rPr>
+          <w:lang w:val="en-GB"/>
+        </w:rPr>
+        <w:t>xfade</w:t>
+      </w:r>
+      <w:proofErr w:type="spellEnd"/>
+      <w:r>
+        <w:rPr>
+          <w:lang w:val="en-GB"/>
+        </w:rPr>
+        <w:t>) effect.</w:t>
       </w:r>
     </w:p>
     <w:p>
@@ -660,13 +808,23 @@
           <w:lang w:val="en-GB"/>
         </w:rPr>
       </w:pPr>
-      <w:r>
-        <w:rPr>
-          <w:b/>
-          <w:bCs/>
-          <w:lang w:val="en-GB"/>
-        </w:rPr>
-        <w:t>AutoCut Video + GPX Mode</w:t>
+      <w:proofErr w:type="spellStart"/>
+      <w:r>
+        <w:rPr>
+          <w:b/>
+          <w:bCs/>
+          <w:lang w:val="en-GB"/>
+        </w:rPr>
+        <w:t>AutoCut</w:t>
+      </w:r>
+      <w:proofErr w:type="spellEnd"/>
+      <w:r>
+        <w:rPr>
+          <w:b/>
+          <w:bCs/>
+          <w:lang w:val="en-GB"/>
+        </w:rPr>
+        <w:t xml:space="preserve"> Video + GPX Mode</w:t>
       </w:r>
     </w:p>
     <w:p>
@@ -716,7 +874,35 @@
         <w:rPr>
           <w:lang w:val="en-GB"/>
         </w:rPr>
-        <w:t>This mode is convenient if you edit only the gpx file or your gpx files are longer than video.</w:t>
+        <w:t xml:space="preserve">This mode is convenient if you edit only the </w:t>
+      </w:r>
+      <w:proofErr w:type="spellStart"/>
+      <w:r>
+        <w:rPr>
+          <w:lang w:val="en-GB"/>
+        </w:rPr>
+        <w:t>gpx</w:t>
+      </w:r>
+      <w:proofErr w:type="spellEnd"/>
+      <w:r>
+        <w:rPr>
+          <w:lang w:val="en-GB"/>
+        </w:rPr>
+        <w:t xml:space="preserve"> file or your </w:t>
+      </w:r>
+      <w:proofErr w:type="spellStart"/>
+      <w:r>
+        <w:rPr>
+          <w:lang w:val="en-GB"/>
+        </w:rPr>
+        <w:t>gpx</w:t>
+      </w:r>
+      <w:proofErr w:type="spellEnd"/>
+      <w:r>
+        <w:rPr>
+          <w:lang w:val="en-GB"/>
+        </w:rPr>
+        <w:t xml:space="preserve"> files are longer than video.</w:t>
       </w:r>
     </w:p>
     <w:p>
@@ -814,7 +1000,35 @@
         <w:rPr>
           <w:lang w:val="en-GB"/>
         </w:rPr>
-        <w:t>In the list, the time associated to gpx points can be edited by double click. This changes only a single point. If you need to shift all next points, see “chT” button (explained later).</w:t>
+        <w:t xml:space="preserve">In the list, the time associated to </w:t>
+      </w:r>
+      <w:proofErr w:type="spellStart"/>
+      <w:r>
+        <w:rPr>
+          <w:lang w:val="en-GB"/>
+        </w:rPr>
+        <w:t>gpx</w:t>
+      </w:r>
+      <w:proofErr w:type="spellEnd"/>
+      <w:r>
+        <w:rPr>
+          <w:lang w:val="en-GB"/>
+        </w:rPr>
+        <w:t xml:space="preserve"> points can be edited by double click. This changes only a single point. If you need to shift all next points, see “</w:t>
+      </w:r>
+      <w:proofErr w:type="spellStart"/>
+      <w:r>
+        <w:rPr>
+          <w:lang w:val="en-GB"/>
+        </w:rPr>
+        <w:t>chT</w:t>
+      </w:r>
+      <w:proofErr w:type="spellEnd"/>
+      <w:r>
+        <w:rPr>
+          <w:lang w:val="en-GB"/>
+        </w:rPr>
+        <w:t>” button (explained later).</w:t>
       </w:r>
     </w:p>
     <w:p>
@@ -1321,22 +1535,50 @@
         </w:rPr>
         <w:br/>
       </w:r>
-      <w:r>
-        <w:rPr>
-          <w:b/>
-          <w:bCs/>
-          <w:lang w:val="en-GB"/>
-        </w:rPr>
-        <w:t>Gopro-Extractor</w:t>
-      </w:r>
-      <w:r>
-        <w:rPr>
-          <w:b/>
-          <w:bCs/>
-          <w:lang w:val="en-GB"/>
-        </w:rPr>
-        <w:br/>
-        <w:t>Attention: Gopro – GPX will be loaded in Slot 2 ( read Slot description=</w:t>
+      <w:proofErr w:type="spellStart"/>
+      <w:r>
+        <w:rPr>
+          <w:b/>
+          <w:bCs/>
+          <w:lang w:val="en-GB"/>
+        </w:rPr>
+        <w:t>Gopro</w:t>
+      </w:r>
+      <w:proofErr w:type="spellEnd"/>
+      <w:r>
+        <w:rPr>
+          <w:b/>
+          <w:bCs/>
+          <w:lang w:val="en-GB"/>
+        </w:rPr>
+        <w:t>-Extractor</w:t>
+      </w:r>
+      <w:r>
+        <w:rPr>
+          <w:b/>
+          <w:bCs/>
+          <w:lang w:val="en-GB"/>
+        </w:rPr>
+        <w:br/>
+        <w:t xml:space="preserve">Attention: </w:t>
+      </w:r>
+      <w:proofErr w:type="spellStart"/>
+      <w:r>
+        <w:rPr>
+          <w:b/>
+          <w:bCs/>
+          <w:lang w:val="en-GB"/>
+        </w:rPr>
+        <w:t>Gopro</w:t>
+      </w:r>
+      <w:proofErr w:type="spellEnd"/>
+      <w:r>
+        <w:rPr>
+          <w:b/>
+          <w:bCs/>
+          <w:lang w:val="en-GB"/>
+        </w:rPr>
+        <w:t xml:space="preserve"> – GPX will be loaded in Slot 2 ( read Slot description=</w:t>
       </w:r>
     </w:p>
     <w:p>
@@ -1419,7 +1661,21 @@
           <w:lang w:val="en-GB"/>
         </w:rPr>
         <w:br/>
-        <w:t>2. Select **File → Import Video → Extract Gopo-GPS**</w:t>
+        <w:t xml:space="preserve">2. Select **File → Import Video → Extract </w:t>
+      </w:r>
+      <w:proofErr w:type="spellStart"/>
+      <w:r>
+        <w:rPr>
+          <w:lang w:val="en-GB"/>
+        </w:rPr>
+        <w:t>Gopo</w:t>
+      </w:r>
+      <w:proofErr w:type="spellEnd"/>
+      <w:r>
+        <w:rPr>
+          <w:lang w:val="en-GB"/>
+        </w:rPr>
+        <w:t>-GPS**</w:t>
       </w:r>
       <w:r>
         <w:rPr>
@@ -1493,7 +1749,35 @@
         <w:rPr>
           <w:lang w:val="en-GB"/>
         </w:rPr>
-        <w:t xml:space="preserve"> ( for sync Slot1 ypu need ony the first one)</w:t>
+        <w:t xml:space="preserve"> ( for sync Slot1 </w:t>
+      </w:r>
+      <w:proofErr w:type="spellStart"/>
+      <w:r>
+        <w:rPr>
+          <w:lang w:val="en-GB"/>
+        </w:rPr>
+        <w:t>ypu</w:t>
+      </w:r>
+      <w:proofErr w:type="spellEnd"/>
+      <w:r>
+        <w:rPr>
+          <w:lang w:val="en-GB"/>
+        </w:rPr>
+        <w:t xml:space="preserve"> need </w:t>
+      </w:r>
+      <w:proofErr w:type="spellStart"/>
+      <w:r>
+        <w:rPr>
+          <w:lang w:val="en-GB"/>
+        </w:rPr>
+        <w:t>ony</w:t>
+      </w:r>
+      <w:proofErr w:type="spellEnd"/>
+      <w:r>
+        <w:rPr>
+          <w:lang w:val="en-GB"/>
+        </w:rPr>
+        <w:t xml:space="preserve"> the first one)</w:t>
       </w:r>
       <w:r>
         <w:rPr>
@@ -1579,7 +1863,21 @@
         <w:rPr>
           <w:lang w:val="en-GB"/>
         </w:rPr>
-        <w:t xml:space="preserve">  - Use **Update Elevation** in the GPX Control panel (requires Mapbox key)</w:t>
+        <w:t xml:space="preserve">  - Use **Update Elevation** in the GPX Control panel (requires </w:t>
+      </w:r>
+      <w:proofErr w:type="spellStart"/>
+      <w:r>
+        <w:rPr>
+          <w:lang w:val="en-GB"/>
+        </w:rPr>
+        <w:t>Mapbox</w:t>
+      </w:r>
+      <w:proofErr w:type="spellEnd"/>
+      <w:r>
+        <w:rPr>
+          <w:lang w:val="en-GB"/>
+        </w:rPr>
+        <w:t xml:space="preserve"> key)</w:t>
       </w:r>
       <w:r>
         <w:rPr>
@@ -1716,7 +2014,21 @@
         <w:rPr>
           <w:lang w:val="en-GB"/>
         </w:rPr>
-        <w:t>safe the actual loaded files and edits in a project file, you can work later on it, but you cant undo any edits!</w:t>
+        <w:t xml:space="preserve">safe the actual loaded files and edits in a project file, you can work later on it, but you </w:t>
+      </w:r>
+      <w:proofErr w:type="spellStart"/>
+      <w:r>
+        <w:rPr>
+          <w:lang w:val="en-GB"/>
+        </w:rPr>
+        <w:t>cant</w:t>
+      </w:r>
+      <w:proofErr w:type="spellEnd"/>
+      <w:r>
+        <w:rPr>
+          <w:lang w:val="en-GB"/>
+        </w:rPr>
+        <w:t xml:space="preserve"> undo any edits!</w:t>
       </w:r>
       <w:r>
         <w:rPr>
@@ -1782,7 +2094,21 @@
         <w:rPr>
           <w:lang w:val="en-GB"/>
         </w:rPr>
-        <w:t>Saves the video with all cuts applied using the LossLessCut method (Copy-Mode) or the Encoder method (Encode-Mode)</w:t>
+        <w:t xml:space="preserve">Saves the video with all cuts applied using the </w:t>
+      </w:r>
+      <w:proofErr w:type="spellStart"/>
+      <w:r>
+        <w:rPr>
+          <w:lang w:val="en-GB"/>
+        </w:rPr>
+        <w:t>LossLessCut</w:t>
+      </w:r>
+      <w:proofErr w:type="spellEnd"/>
+      <w:r>
+        <w:rPr>
+          <w:lang w:val="en-GB"/>
+        </w:rPr>
+        <w:t xml:space="preserve"> method (Copy-Mode) or the Encoder method (Encode-Mode)</w:t>
       </w:r>
       <w:r>
         <w:rPr>
@@ -1828,7 +2154,7 @@
       </w:pPr>
       <w:r>
         <w:pict w14:anchorId="720AFAC8">
-          <v:rect id="Rechteck 11" o:spid="_x0000_s1050" style="width:453.6pt;height:1.5pt;visibility:visible;mso-wrap-style:square;mso-left-percent:-10001;mso-top-percent:-10001;mso-position-horizontal:absolute;mso-position-horizontal-relative:char;mso-position-vertical:absolute;mso-position-vertical-relative:line;mso-left-percent:-10001;mso-top-percent:-10001;v-text-anchor:top" fillcolor="#a0a0a0" stroked="f" strokeweight="0">
+          <v:rect id="Rechteck 11" o:spid="_x0000_s1031" style="width:453.6pt;height:1.5pt;visibility:visible;mso-wrap-style:square;mso-left-percent:-10001;mso-top-percent:-10001;mso-position-horizontal:absolute;mso-position-horizontal-relative:char;mso-position-vertical:absolute;mso-position-vertical-relative:line;mso-left-percent:-10001;mso-top-percent:-10001;v-text-anchor:top" fillcolor="#a0a0a0" stroked="f" strokeweight="0">
             <w10:anchorlock/>
           </v:rect>
         </w:pict>
@@ -2176,7 +2502,7 @@
       </w:pPr>
       <w:r>
         <w:pict w14:anchorId="2C2B23F8">
-          <v:rect id="Rechteck 13" o:spid="_x0000_s1049" style="width:453.6pt;height:1.5pt;visibility:visible;mso-wrap-style:square;mso-left-percent:-10001;mso-top-percent:-10001;mso-position-horizontal:absolute;mso-position-horizontal-relative:char;mso-position-vertical:absolute;mso-position-vertical-relative:line;mso-left-percent:-10001;mso-top-percent:-10001;v-text-anchor:top" fillcolor="#a0a0a0" stroked="f" strokeweight="0">
+          <v:rect id="Rechteck 13" o:spid="_x0000_s1030" style="width:453.6pt;height:1.5pt;visibility:visible;mso-wrap-style:square;mso-left-percent:-10001;mso-top-percent:-10001;mso-position-horizontal:absolute;mso-position-horizontal-relative:char;mso-position-vertical:absolute;mso-position-vertical-relative:line;mso-left-percent:-10001;mso-top-percent:-10001;v-text-anchor:top" fillcolor="#a0a0a0" stroked="f" strokeweight="0">
             <w10:anchorlock/>
           </v:rect>
         </w:pict>
@@ -2236,7 +2562,21 @@
         <w:rPr>
           <w:lang w:val="en-GB"/>
         </w:rPr>
-        <w:t>Switch to the “classic” edit view composed of video, map, chart and gpx list (see before).</w:t>
+        <w:t xml:space="preserve">Switch to the “classic” edit view composed of video, map, chart and </w:t>
+      </w:r>
+      <w:proofErr w:type="spellStart"/>
+      <w:r>
+        <w:rPr>
+          <w:lang w:val="en-GB"/>
+        </w:rPr>
+        <w:t>gpx</w:t>
+      </w:r>
+      <w:proofErr w:type="spellEnd"/>
+      <w:r>
+        <w:rPr>
+          <w:lang w:val="en-GB"/>
+        </w:rPr>
+        <w:t xml:space="preserve"> list (see before).</w:t>
       </w:r>
     </w:p>
     <w:p>
@@ -2269,7 +2609,21 @@
         <w:rPr>
           <w:lang w:val="en-GB"/>
         </w:rPr>
-        <w:t>Switch to the gpx creation mode with a view composed of video, map and street view (see before). “Sync all with video” option is then activated.</w:t>
+        <w:t xml:space="preserve">Switch to the </w:t>
+      </w:r>
+      <w:proofErr w:type="spellStart"/>
+      <w:r>
+        <w:rPr>
+          <w:lang w:val="en-GB"/>
+        </w:rPr>
+        <w:t>gpx</w:t>
+      </w:r>
+      <w:proofErr w:type="spellEnd"/>
+      <w:r>
+        <w:rPr>
+          <w:lang w:val="en-GB"/>
+        </w:rPr>
+        <w:t xml:space="preserve"> creation mode with a view composed of video, map and street view (see before). “Sync all with video” option is then activated.</w:t>
       </w:r>
     </w:p>
     <w:p>
@@ -2396,7 +2750,25 @@
           <w:lang w:val="en-GB"/>
         </w:rPr>
         <w:br/>
-        <w:t>if activated you can use CTRL+ + / CTRL + - / CTRL+ ArrowKeys for PAN/TILT/ZOOM</w:t>
+        <w:t xml:space="preserve">if activated you can use CTRL+ + / CTRL + - / CTRL+ </w:t>
+      </w:r>
+      <w:proofErr w:type="spellStart"/>
+      <w:r>
+        <w:rPr>
+          <w:sz w:val="24"/>
+          <w:szCs w:val="24"/>
+          <w:lang w:val="en-GB"/>
+        </w:rPr>
+        <w:t>ArrowKeys</w:t>
+      </w:r>
+      <w:proofErr w:type="spellEnd"/>
+      <w:r>
+        <w:rPr>
+          <w:sz w:val="24"/>
+          <w:szCs w:val="24"/>
+          <w:lang w:val="en-GB"/>
+        </w:rPr>
+        <w:t xml:space="preserve"> for PAN/TILT/ZOOM</w:t>
       </w:r>
     </w:p>
     <w:p>
@@ -2449,7 +2821,7 @@
       </w:pPr>
       <w:r>
         <w:pict w14:anchorId="70E2A37C">
-          <v:rect id="Rechteck 15" o:spid="_x0000_s1048" style="width:453.6pt;height:1.5pt;visibility:visible;mso-wrap-style:square;mso-left-percent:-10001;mso-top-percent:-10001;mso-position-horizontal:absolute;mso-position-horizontal-relative:char;mso-position-vertical:absolute;mso-position-vertical-relative:line;mso-left-percent:-10001;mso-top-percent:-10001;v-text-anchor:top" fillcolor="#a0a0a0" stroked="f" strokeweight="0">
+          <v:rect id="Rechteck 15" o:spid="_x0000_s1029" style="width:453.6pt;height:1.5pt;visibility:visible;mso-wrap-style:square;mso-left-percent:-10001;mso-top-percent:-10001;mso-position-horizontal:absolute;mso-position-horizontal-relative:char;mso-position-vertical:absolute;mso-position-vertical-relative:line;mso-left-percent:-10001;mso-top-percent:-10001;v-text-anchor:top" fillcolor="#a0a0a0" stroked="f" strokeweight="0">
             <w10:anchorlock/>
           </v:rect>
         </w:pict>
@@ -2570,7 +2942,21 @@
           <w:lang w:val="en-GB"/>
         </w:rPr>
         <w:br/>
-        <w:t>As mentioned earlier, this uses LossLessCut.</w:t>
+        <w:t xml:space="preserve">As mentioned earlier, this uses </w:t>
+      </w:r>
+      <w:proofErr w:type="spellStart"/>
+      <w:r>
+        <w:rPr>
+          <w:lang w:val="en-GB"/>
+        </w:rPr>
+        <w:t>LossLessCut</w:t>
+      </w:r>
+      <w:proofErr w:type="spellEnd"/>
+      <w:r>
+        <w:rPr>
+          <w:lang w:val="en-GB"/>
+        </w:rPr>
+        <w:t>.</w:t>
       </w:r>
       <w:r>
         <w:rPr>
@@ -2626,7 +3012,21 @@
           <w:lang w:val="en-GB"/>
         </w:rPr>
         <w:lastRenderedPageBreak/>
-        <w:t>Crossfades (xfades) – smooth transitions between clips – are applied.</w:t>
+        <w:t>Crossfades (</w:t>
+      </w:r>
+      <w:proofErr w:type="spellStart"/>
+      <w:r>
+        <w:rPr>
+          <w:lang w:val="en-GB"/>
+        </w:rPr>
+        <w:t>xfades</w:t>
+      </w:r>
+      <w:proofErr w:type="spellEnd"/>
+      <w:r>
+        <w:rPr>
+          <w:lang w:val="en-GB"/>
+        </w:rPr>
+        <w:t>) – smooth transitions between clips – are applied.</w:t>
       </w:r>
       <w:r>
         <w:rPr>
@@ -2934,6 +3334,7 @@
           <w:lang w:val="en-GB"/>
         </w:rPr>
       </w:pPr>
+      <w:proofErr w:type="spellStart"/>
       <w:r>
         <w:rPr>
           <w:b/>
@@ -2942,6 +3343,7 @@
         </w:rPr>
         <w:t>XFade</w:t>
       </w:r>
+      <w:proofErr w:type="spellEnd"/>
       <w:r>
         <w:rPr>
           <w:lang w:val="en-GB"/>
@@ -3111,7 +3513,21 @@
           <w:lang w:val="en-GB"/>
         </w:rPr>
         <w:br/>
-        <w:t>You can also choose the corner in which the overlay should appear, and use dx and dy to shift it slightly inward from the edge, so it doesn’t appear “crammed” into the corner.</w:t>
+        <w:t xml:space="preserve">You can also choose the corner in which the overlay should appear, and use dx and </w:t>
+      </w:r>
+      <w:proofErr w:type="spellStart"/>
+      <w:r>
+        <w:rPr>
+          <w:lang w:val="en-GB"/>
+        </w:rPr>
+        <w:t>dy</w:t>
+      </w:r>
+      <w:proofErr w:type="spellEnd"/>
+      <w:r>
+        <w:rPr>
+          <w:lang w:val="en-GB"/>
+        </w:rPr>
+        <w:t xml:space="preserve"> to shift it slightly inward from the edge, so it doesn’t appear “crammed” into the corner.</w:t>
       </w:r>
     </w:p>
     <w:p>
@@ -3138,7 +3554,21 @@
           <w:lang w:val="en-GB"/>
         </w:rPr>
         <w:br/>
-        <w:t>Use the Ovl button in the Video Editor Control panel.</w:t>
+        <w:t xml:space="preserve">Use the </w:t>
+      </w:r>
+      <w:proofErr w:type="spellStart"/>
+      <w:r>
+        <w:rPr>
+          <w:lang w:val="en-GB"/>
+        </w:rPr>
+        <w:t>Ovl</w:t>
+      </w:r>
+      <w:proofErr w:type="spellEnd"/>
+      <w:r>
+        <w:rPr>
+          <w:lang w:val="en-GB"/>
+        </w:rPr>
+        <w:t xml:space="preserve"> button in the Video Editor Control panel.</w:t>
       </w:r>
       <w:r>
         <w:rPr>
@@ -3207,8 +3637,21 @@
         <w:spacing w:line="254" w:lineRule="auto"/>
       </w:pPr>
       <w:r>
-        <w:t>Set display duration</w:t>
-      </w:r>
+        <w:t xml:space="preserve">Set </w:t>
+      </w:r>
+      <w:proofErr w:type="spellStart"/>
+      <w:r>
+        <w:t>display</w:t>
+      </w:r>
+      <w:proofErr w:type="spellEnd"/>
+      <w:r>
+        <w:t xml:space="preserve"> </w:t>
+      </w:r>
+      <w:proofErr w:type="spellStart"/>
+      <w:r>
+        <w:t>duration</w:t>
+      </w:r>
+      <w:proofErr w:type="spellEnd"/>
     </w:p>
     <w:p>
       <w:pPr>
@@ -3273,7 +3716,21 @@
           <w:lang w:val="en-GB"/>
         </w:rPr>
         <w:br/>
-        <w:t>Note: Platforms like Kinomap generally discourage the use of overlays – so it’s best to limit them to a brief logo only.</w:t>
+        <w:t xml:space="preserve">Note: Platforms like </w:t>
+      </w:r>
+      <w:proofErr w:type="spellStart"/>
+      <w:r>
+        <w:rPr>
+          <w:lang w:val="en-GB"/>
+        </w:rPr>
+        <w:t>Kinomap</w:t>
+      </w:r>
+      <w:proofErr w:type="spellEnd"/>
+      <w:r>
+        <w:rPr>
+          <w:lang w:val="en-GB"/>
+        </w:rPr>
+        <w:t xml:space="preserve"> generally discourage the use of overlays – so it’s best to limit them to a brief logo only.</w:t>
       </w:r>
     </w:p>
     <w:p>
@@ -3314,6 +3771,7 @@
           <w:lang w:val="en-GB"/>
         </w:rPr>
       </w:pPr>
+      <w:proofErr w:type="spellStart"/>
       <w:r>
         <w:rPr>
           <w:b/>
@@ -3322,6 +3780,7 @@
         </w:rPr>
         <w:t>AutoCutVideo+GPX</w:t>
       </w:r>
+      <w:proofErr w:type="spellEnd"/>
     </w:p>
     <w:p>
       <w:pPr>
@@ -3443,21 +3902,53 @@
           <w:bCs/>
           <w:lang w:val="en-GB"/>
         </w:rPr>
-        <w:t>Show Endcut Warning</w:t>
-      </w:r>
-      <w:r>
-        <w:rPr>
-          <w:b/>
-          <w:bCs/>
-          <w:lang w:val="en-GB"/>
-        </w:rPr>
-        <w:br/>
-      </w:r>
-      <w:r>
-        <w:rPr>
-          <w:lang w:val="en-GB"/>
-        </w:rPr>
-        <w:t>shows a pop-up when the player reached a Endcut ( you set a cut on the end</w:t>
+        <w:t xml:space="preserve">Show </w:t>
+      </w:r>
+      <w:proofErr w:type="spellStart"/>
+      <w:r>
+        <w:rPr>
+          <w:b/>
+          <w:bCs/>
+          <w:lang w:val="en-GB"/>
+        </w:rPr>
+        <w:t>Endcut</w:t>
+      </w:r>
+      <w:proofErr w:type="spellEnd"/>
+      <w:r>
+        <w:rPr>
+          <w:b/>
+          <w:bCs/>
+          <w:lang w:val="en-GB"/>
+        </w:rPr>
+        <w:t xml:space="preserve"> Warning</w:t>
+      </w:r>
+      <w:r>
+        <w:rPr>
+          <w:b/>
+          <w:bCs/>
+          <w:lang w:val="en-GB"/>
+        </w:rPr>
+        <w:br/>
+      </w:r>
+      <w:r>
+        <w:rPr>
+          <w:lang w:val="en-GB"/>
+        </w:rPr>
+        <w:t xml:space="preserve">shows a pop-up when the player reached a </w:t>
+      </w:r>
+      <w:proofErr w:type="spellStart"/>
+      <w:r>
+        <w:rPr>
+          <w:lang w:val="en-GB"/>
+        </w:rPr>
+        <w:t>Endcut</w:t>
+      </w:r>
+      <w:proofErr w:type="spellEnd"/>
+      <w:r>
+        <w:rPr>
+          <w:lang w:val="en-GB"/>
+        </w:rPr>
+        <w:t xml:space="preserve"> ( you set a cut on the end</w:t>
       </w:r>
       <w:r>
         <w:rPr>
@@ -3771,8 +4262,18 @@
           <w:iCs/>
           <w:lang w:val="en-GB"/>
         </w:rPr>
-        <w:t>Show Endcut</w:t>
-      </w:r>
+        <w:t xml:space="preserve">Show </w:t>
+      </w:r>
+      <w:proofErr w:type="spellStart"/>
+      <w:r>
+        <w:rPr>
+          <w:i/>
+          <w:iCs/>
+          <w:lang w:val="en-GB"/>
+        </w:rPr>
+        <w:t>Endcut</w:t>
+      </w:r>
+      <w:proofErr w:type="spellEnd"/>
       <w:r>
         <w:rPr>
           <w:i/>
@@ -3820,66 +4321,138 @@
           <w:iCs/>
           <w:lang w:val="en-GB"/>
         </w:rPr>
-        <w:t>Show Endcut Warning</w:t>
-      </w:r>
+        <w:t xml:space="preserve">Show </w:t>
+      </w:r>
+      <w:proofErr w:type="spellStart"/>
       <w:r>
         <w:rPr>
           <w:i/>
           <w:iCs/>
           <w:lang w:val="en-GB"/>
         </w:rPr>
-        <w:br/>
-      </w:r>
-      <w:r>
-        <w:rPr>
-          <w:lang w:val="en-GB"/>
-        </w:rPr>
-        <w:t>ON: You get a warning or OFF:not</w:t>
-      </w:r>
+        <w:t>Endcut</w:t>
+      </w:r>
+      <w:proofErr w:type="spellEnd"/>
       <w:r>
         <w:rPr>
           <w:i/>
           <w:iCs/>
           <w:lang w:val="en-GB"/>
         </w:rPr>
-        <w:br/>
-      </w:r>
-    </w:p>
-    <w:p>
-      <w:pPr>
-        <w:rPr>
-          <w:lang w:val="en-GB"/>
-        </w:rPr>
-      </w:pPr>
-    </w:p>
-    <w:p>
-      <w:pPr>
-        <w:rPr>
-          <w:b/>
-          <w:bCs/>
-          <w:lang w:val="en-GB"/>
-        </w:rPr>
-      </w:pPr>
-      <w:r>
-        <w:rPr>
-          <w:b/>
-          <w:bCs/>
-          <w:lang w:val="en-GB"/>
-        </w:rPr>
-        <w:t xml:space="preserve">FFMPEG / libmpv </w:t>
-      </w:r>
-    </w:p>
-    <w:p>
-      <w:pPr>
-        <w:rPr>
-          <w:lang w:val="en-GB"/>
-        </w:rPr>
-      </w:pPr>
-      <w:r>
-        <w:rPr>
-          <w:lang w:val="en-GB"/>
-        </w:rPr>
-        <w:t>These two menu options ensure compliance with the GPL license requirements for FFmpeg and libmpv.</w:t>
+        <w:t xml:space="preserve"> Warning</w:t>
+      </w:r>
+      <w:r>
+        <w:rPr>
+          <w:i/>
+          <w:iCs/>
+          <w:lang w:val="en-GB"/>
+        </w:rPr>
+        <w:br/>
+      </w:r>
+      <w:r>
+        <w:rPr>
+          <w:lang w:val="en-GB"/>
+        </w:rPr>
+        <w:t xml:space="preserve">ON: You get a warning or </w:t>
+      </w:r>
+      <w:proofErr w:type="spellStart"/>
+      <w:r>
+        <w:rPr>
+          <w:lang w:val="en-GB"/>
+        </w:rPr>
+        <w:t>OFF:not</w:t>
+      </w:r>
+      <w:proofErr w:type="spellEnd"/>
+      <w:r>
+        <w:rPr>
+          <w:i/>
+          <w:iCs/>
+          <w:lang w:val="en-GB"/>
+        </w:rPr>
+        <w:br/>
+      </w:r>
+    </w:p>
+    <w:p>
+      <w:pPr>
+        <w:rPr>
+          <w:lang w:val="en-GB"/>
+        </w:rPr>
+      </w:pPr>
+    </w:p>
+    <w:p>
+      <w:pPr>
+        <w:rPr>
+          <w:b/>
+          <w:bCs/>
+          <w:lang w:val="en-GB"/>
+        </w:rPr>
+      </w:pPr>
+      <w:r>
+        <w:rPr>
+          <w:b/>
+          <w:bCs/>
+          <w:lang w:val="en-GB"/>
+        </w:rPr>
+        <w:t xml:space="preserve">FFMPEG / </w:t>
+      </w:r>
+      <w:proofErr w:type="spellStart"/>
+      <w:r>
+        <w:rPr>
+          <w:b/>
+          <w:bCs/>
+          <w:lang w:val="en-GB"/>
+        </w:rPr>
+        <w:t>libmpv</w:t>
+      </w:r>
+      <w:proofErr w:type="spellEnd"/>
+      <w:r>
+        <w:rPr>
+          <w:b/>
+          <w:bCs/>
+          <w:lang w:val="en-GB"/>
+        </w:rPr>
+        <w:t xml:space="preserve"> </w:t>
+      </w:r>
+    </w:p>
+    <w:p>
+      <w:pPr>
+        <w:rPr>
+          <w:lang w:val="en-GB"/>
+        </w:rPr>
+      </w:pPr>
+      <w:r>
+        <w:rPr>
+          <w:lang w:val="en-GB"/>
+        </w:rPr>
+        <w:t xml:space="preserve">These two menu options ensure compliance with the GPL license requirements for </w:t>
+      </w:r>
+      <w:proofErr w:type="spellStart"/>
+      <w:r>
+        <w:rPr>
+          <w:lang w:val="en-GB"/>
+        </w:rPr>
+        <w:t>FFmpeg</w:t>
+      </w:r>
+      <w:proofErr w:type="spellEnd"/>
+      <w:r>
+        <w:rPr>
+          <w:lang w:val="en-GB"/>
+        </w:rPr>
+        <w:t xml:space="preserve"> and </w:t>
+      </w:r>
+      <w:proofErr w:type="spellStart"/>
+      <w:r>
+        <w:rPr>
+          <w:lang w:val="en-GB"/>
+        </w:rPr>
+        <w:t>libmpv</w:t>
+      </w:r>
+      <w:proofErr w:type="spellEnd"/>
+      <w:r>
+        <w:rPr>
+          <w:lang w:val="en-GB"/>
+        </w:rPr>
+        <w:t>.</w:t>
       </w:r>
     </w:p>
     <w:p>
@@ -3896,7 +4469,35 @@
         <w:rPr>
           <w:lang w:val="en-GB"/>
         </w:rPr>
-        <w:t>Here, users can specify their own FFmpeg or libmpv files by entering the file paths.</w:t>
+        <w:t xml:space="preserve">Here, users can specify their own </w:t>
+      </w:r>
+      <w:proofErr w:type="spellStart"/>
+      <w:r>
+        <w:rPr>
+          <w:lang w:val="en-GB"/>
+        </w:rPr>
+        <w:t>FFmpeg</w:t>
+      </w:r>
+      <w:proofErr w:type="spellEnd"/>
+      <w:r>
+        <w:rPr>
+          <w:lang w:val="en-GB"/>
+        </w:rPr>
+        <w:t xml:space="preserve"> or </w:t>
+      </w:r>
+      <w:proofErr w:type="spellStart"/>
+      <w:r>
+        <w:rPr>
+          <w:lang w:val="en-GB"/>
+        </w:rPr>
+        <w:t>libmpv</w:t>
+      </w:r>
+      <w:proofErr w:type="spellEnd"/>
+      <w:r>
+        <w:rPr>
+          <w:lang w:val="en-GB"/>
+        </w:rPr>
+        <w:t xml:space="preserve"> files by entering the file paths.</w:t>
       </w:r>
     </w:p>
     <w:p>
@@ -3948,7 +4549,21 @@
         <w:rPr>
           <w:lang w:val="en-GB"/>
         </w:rPr>
-        <w:t>The Encode-Mode need a lot of HD Space and imn case you haven’t enough on the actually Partition, you can choose another Directory!</w:t>
+        <w:t xml:space="preserve">The Encode-Mode need a lot of HD Space and </w:t>
+      </w:r>
+      <w:proofErr w:type="spellStart"/>
+      <w:r>
+        <w:rPr>
+          <w:lang w:val="en-GB"/>
+        </w:rPr>
+        <w:t>imn</w:t>
+      </w:r>
+      <w:proofErr w:type="spellEnd"/>
+      <w:r>
+        <w:rPr>
+          <w:lang w:val="en-GB"/>
+        </w:rPr>
+        <w:t xml:space="preserve"> case you haven’t enough on the actually Partition, you can choose another Directory!</w:t>
       </w:r>
       <w:r>
         <w:rPr>
@@ -4051,8 +4666,18 @@
           <w:bCs/>
           <w:lang w:val="en-GB"/>
         </w:rPr>
-        <w:t>Mark ZeroSpeed</w:t>
-      </w:r>
+        <w:t xml:space="preserve">Mark </w:t>
+      </w:r>
+      <w:proofErr w:type="spellStart"/>
+      <w:r>
+        <w:rPr>
+          <w:b/>
+          <w:bCs/>
+          <w:lang w:val="en-GB"/>
+        </w:rPr>
+        <w:t>ZeroSpeed</w:t>
+      </w:r>
+      <w:proofErr w:type="spellEnd"/>
     </w:p>
     <w:p>
       <w:pPr>
@@ -4089,6 +4714,7 @@
         </w:rPr>
         <w:t xml:space="preserve">Mark </w:t>
       </w:r>
+      <w:proofErr w:type="spellStart"/>
       <w:r>
         <w:rPr>
           <w:b/>
@@ -4097,6 +4723,7 @@
         </w:rPr>
         <w:t>TimeGaps</w:t>
       </w:r>
+      <w:proofErr w:type="spellEnd"/>
       <w:r>
         <w:rPr>
           <w:b/>
@@ -4179,7 +4806,21 @@
           <w:lang w:val="en-GB"/>
         </w:rPr>
         <w:br/>
-        <w:t>If you have a Mapbox key/token set up, you can use the Directions function to draw a route that follows known roads and paths, just like a route planner. Two new buttons will be added to the map, allowing you to choose whether the route should be drawn for cars, bicycles, or pedestrians. Additionally, the "Close Gaps" function (see below) will also change accordingly.</w:t>
+        <w:t xml:space="preserve">If you have a </w:t>
+      </w:r>
+      <w:proofErr w:type="spellStart"/>
+      <w:r>
+        <w:rPr>
+          <w:lang w:val="en-GB"/>
+        </w:rPr>
+        <w:t>Mapbox</w:t>
+      </w:r>
+      <w:proofErr w:type="spellEnd"/>
+      <w:r>
+        <w:rPr>
+          <w:lang w:val="en-GB"/>
+        </w:rPr>
+        <w:t xml:space="preserve"> key/token set up, you can use the Directions function to draw a route that follows known roads and paths, just like a route planner. Two new buttons will be added to the map, allowing you to choose whether the route should be drawn for cars, bicycles, or pedestrians. Additionally, the "Close Gaps" function (see below) will also change accordingly.</w:t>
       </w:r>
     </w:p>
     <w:p>
@@ -4225,7 +4866,21 @@
           <w:lang w:val="en-GB"/>
         </w:rPr>
         <w:br/>
-        <w:t>Most providers offer a large number of free tiles per month. At the time of this software's release, Mapbox provided 50,000 free tiles per month—a limit that most users will never exceed.</w:t>
+        <w:t xml:space="preserve">Most providers offer a large number of free tiles per month. At the time of this software's release, </w:t>
+      </w:r>
+      <w:proofErr w:type="spellStart"/>
+      <w:r>
+        <w:rPr>
+          <w:lang w:val="en-GB"/>
+        </w:rPr>
+        <w:t>Mapbox</w:t>
+      </w:r>
+      <w:proofErr w:type="spellEnd"/>
+      <w:r>
+        <w:rPr>
+          <w:lang w:val="en-GB"/>
+        </w:rPr>
+        <w:t xml:space="preserve"> provided 50,000 free tiles per month—a limit that most users will never exceed.</w:t>
       </w:r>
     </w:p>
     <w:p>
@@ -4367,7 +5022,21 @@
         <w:rPr>
           <w:lang w:val="en-GB"/>
         </w:rPr>
-        <w:t>New points inserted at current video time. If Directions is activated and Mapbox provided, a route is created to the new point (after ask transport mode).</w:t>
+        <w:t xml:space="preserve">New points inserted at current video time. If Directions is activated and </w:t>
+      </w:r>
+      <w:proofErr w:type="spellStart"/>
+      <w:r>
+        <w:rPr>
+          <w:lang w:val="en-GB"/>
+        </w:rPr>
+        <w:t>Mapbox</w:t>
+      </w:r>
+      <w:proofErr w:type="spellEnd"/>
+      <w:r>
+        <w:rPr>
+          <w:lang w:val="en-GB"/>
+        </w:rPr>
+        <w:t xml:space="preserve"> provided, a route is created to the new point (after ask transport mode).</w:t>
       </w:r>
     </w:p>
     <w:p>
@@ -4780,26 +5449,50 @@
           <w:lang w:val="en-GB"/>
         </w:rPr>
       </w:pPr>
-      <w:r>
-        <w:rPr>
-          <w:b/>
-          <w:bCs/>
-          <w:lang w:val="en-GB"/>
-        </w:rPr>
-        <w:t>Youtube tutorials</w:t>
-      </w:r>
-    </w:p>
-    <w:p>
-      <w:pPr>
-        <w:rPr>
-          <w:lang w:val="en-GB"/>
-        </w:rPr>
-      </w:pPr>
-      <w:r>
-        <w:rPr>
-          <w:lang w:val="en-GB"/>
-        </w:rPr>
-        <w:t>Opens Youtube channel in browser</w:t>
+      <w:proofErr w:type="spellStart"/>
+      <w:r>
+        <w:rPr>
+          <w:b/>
+          <w:bCs/>
+          <w:lang w:val="en-GB"/>
+        </w:rPr>
+        <w:t>Youtube</w:t>
+      </w:r>
+      <w:proofErr w:type="spellEnd"/>
+      <w:r>
+        <w:rPr>
+          <w:b/>
+          <w:bCs/>
+          <w:lang w:val="en-GB"/>
+        </w:rPr>
+        <w:t xml:space="preserve"> tutorials</w:t>
+      </w:r>
+    </w:p>
+    <w:p>
+      <w:pPr>
+        <w:rPr>
+          <w:lang w:val="en-GB"/>
+        </w:rPr>
+      </w:pPr>
+      <w:r>
+        <w:rPr>
+          <w:lang w:val="en-GB"/>
+        </w:rPr>
+        <w:t xml:space="preserve">Opens </w:t>
+      </w:r>
+      <w:proofErr w:type="spellStart"/>
+      <w:r>
+        <w:rPr>
+          <w:lang w:val="en-GB"/>
+        </w:rPr>
+        <w:t>Youtube</w:t>
+      </w:r>
+      <w:proofErr w:type="spellEnd"/>
+      <w:r>
+        <w:rPr>
+          <w:lang w:val="en-GB"/>
+        </w:rPr>
+        <w:t xml:space="preserve"> channel in browser</w:t>
       </w:r>
     </w:p>
     <w:p>
@@ -4938,7 +5631,21 @@
           <w:lang w:val="en-GB"/>
         </w:rPr>
         <w:br/>
-        <w:t>Some buttons only appear after Video Edit is enabled, while others change functionality when AutoCutVideo+GPX is activated.</w:t>
+        <w:t xml:space="preserve">Some buttons only appear after Video Edit is enabled, while others change functionality when </w:t>
+      </w:r>
+      <w:proofErr w:type="spellStart"/>
+      <w:r>
+        <w:rPr>
+          <w:lang w:val="en-GB"/>
+        </w:rPr>
+        <w:t>AutoCutVideo+GPX</w:t>
+      </w:r>
+      <w:proofErr w:type="spellEnd"/>
+      <w:r>
+        <w:rPr>
+          <w:lang w:val="en-GB"/>
+        </w:rPr>
+        <w:t xml:space="preserve"> is activated.</w:t>
       </w:r>
     </w:p>
     <w:p>
@@ -5130,7 +5837,119 @@
           <w:lang w:val="en-GB"/>
         </w:rPr>
         <w:br/>
-        <w:t>Play/Pause – Go to start – Go to end – Step-Value – Multiplier Stepper – Step Left – Step Right – SetTime – MarkB – MarkE – Deselect [x] – Cut – CutBegin – CutEnd –  GSync – Overlay [Ovl] – AutoCutVideo+GPX [VG]</w:t>
+        <w:t xml:space="preserve">Play/Pause – Go to start – Go to end – Step-Value – Multiplier Stepper – Step Left – Step Right – </w:t>
+      </w:r>
+      <w:proofErr w:type="spellStart"/>
+      <w:r>
+        <w:rPr>
+          <w:lang w:val="en-GB"/>
+        </w:rPr>
+        <w:t>SetTime</w:t>
+      </w:r>
+      <w:proofErr w:type="spellEnd"/>
+      <w:r>
+        <w:rPr>
+          <w:lang w:val="en-GB"/>
+        </w:rPr>
+        <w:t xml:space="preserve"> – </w:t>
+      </w:r>
+      <w:proofErr w:type="spellStart"/>
+      <w:r>
+        <w:rPr>
+          <w:lang w:val="en-GB"/>
+        </w:rPr>
+        <w:t>MarkB</w:t>
+      </w:r>
+      <w:proofErr w:type="spellEnd"/>
+      <w:r>
+        <w:rPr>
+          <w:lang w:val="en-GB"/>
+        </w:rPr>
+        <w:t xml:space="preserve"> – </w:t>
+      </w:r>
+      <w:proofErr w:type="spellStart"/>
+      <w:r>
+        <w:rPr>
+          <w:lang w:val="en-GB"/>
+        </w:rPr>
+        <w:t>MarkE</w:t>
+      </w:r>
+      <w:proofErr w:type="spellEnd"/>
+      <w:r>
+        <w:rPr>
+          <w:lang w:val="en-GB"/>
+        </w:rPr>
+        <w:t xml:space="preserve"> – Deselect [x] – Cut – </w:t>
+      </w:r>
+      <w:proofErr w:type="spellStart"/>
+      <w:r>
+        <w:rPr>
+          <w:lang w:val="en-GB"/>
+        </w:rPr>
+        <w:t>CutBegin</w:t>
+      </w:r>
+      <w:proofErr w:type="spellEnd"/>
+      <w:r>
+        <w:rPr>
+          <w:lang w:val="en-GB"/>
+        </w:rPr>
+        <w:t xml:space="preserve"> – </w:t>
+      </w:r>
+      <w:proofErr w:type="spellStart"/>
+      <w:r>
+        <w:rPr>
+          <w:lang w:val="en-GB"/>
+        </w:rPr>
+        <w:t>CutEnd</w:t>
+      </w:r>
+      <w:proofErr w:type="spellEnd"/>
+      <w:r>
+        <w:rPr>
+          <w:lang w:val="en-GB"/>
+        </w:rPr>
+        <w:t xml:space="preserve"> –  </w:t>
+      </w:r>
+      <w:proofErr w:type="spellStart"/>
+      <w:r>
+        <w:rPr>
+          <w:lang w:val="en-GB"/>
+        </w:rPr>
+        <w:t>GSync</w:t>
+      </w:r>
+      <w:proofErr w:type="spellEnd"/>
+      <w:r>
+        <w:rPr>
+          <w:lang w:val="en-GB"/>
+        </w:rPr>
+        <w:t xml:space="preserve"> – Overlay [</w:t>
+      </w:r>
+      <w:proofErr w:type="spellStart"/>
+      <w:r>
+        <w:rPr>
+          <w:lang w:val="en-GB"/>
+        </w:rPr>
+        <w:t>Ovl</w:t>
+      </w:r>
+      <w:proofErr w:type="spellEnd"/>
+      <w:r>
+        <w:rPr>
+          <w:lang w:val="en-GB"/>
+        </w:rPr>
+        <w:t xml:space="preserve">] – </w:t>
+      </w:r>
+      <w:proofErr w:type="spellStart"/>
+      <w:r>
+        <w:rPr>
+          <w:lang w:val="en-GB"/>
+        </w:rPr>
+        <w:t>AutoCutVideo+GPX</w:t>
+      </w:r>
+      <w:proofErr w:type="spellEnd"/>
+      <w:r>
+        <w:rPr>
+          <w:lang w:val="en-GB"/>
+        </w:rPr>
+        <w:t xml:space="preserve"> [VG]</w:t>
       </w:r>
     </w:p>
     <w:p>
@@ -5448,6 +6267,7 @@
           <w:lang w:val="en-GB"/>
         </w:rPr>
       </w:pPr>
+      <w:proofErr w:type="spellStart"/>
       <w:r>
         <w:rPr>
           <w:b/>
@@ -5456,6 +6276,7 @@
         </w:rPr>
         <w:t>SetTime</w:t>
       </w:r>
+      <w:proofErr w:type="spellEnd"/>
       <w:r>
         <w:rPr>
           <w:b/>
@@ -5486,13 +6307,23 @@
           <w:lang w:val="en-GB"/>
         </w:rPr>
       </w:pPr>
-      <w:r>
-        <w:rPr>
-          <w:b/>
-          <w:bCs/>
-          <w:lang w:val="en-GB"/>
-        </w:rPr>
-        <w:t>MarkB [-</w:t>
+      <w:proofErr w:type="spellStart"/>
+      <w:r>
+        <w:rPr>
+          <w:b/>
+          <w:bCs/>
+          <w:lang w:val="en-GB"/>
+        </w:rPr>
+        <w:t>MarkB</w:t>
+      </w:r>
+      <w:proofErr w:type="spellEnd"/>
+      <w:r>
+        <w:rPr>
+          <w:b/>
+          <w:bCs/>
+          <w:lang w:val="en-GB"/>
+        </w:rPr>
+        <w:t xml:space="preserve"> [-</w:t>
       </w:r>
     </w:p>
     <w:p>
@@ -5540,8 +6371,9 @@
           <w:szCs w:val="20"/>
           <w:lang w:val="en-GB"/>
         </w:rPr>
-        <w:t>If AutoCutVideo+GPX is also activated:</w:t>
-      </w:r>
+        <w:t xml:space="preserve">If </w:t>
+      </w:r>
+      <w:proofErr w:type="spellStart"/>
       <w:r>
         <w:rPr>
           <w:b/>
@@ -5552,6 +6384,31 @@
           <w:szCs w:val="20"/>
           <w:lang w:val="en-GB"/>
         </w:rPr>
+        <w:t>AutoCutVideo+GPX</w:t>
+      </w:r>
+      <w:proofErr w:type="spellEnd"/>
+      <w:r>
+        <w:rPr>
+          <w:b/>
+          <w:bCs/>
+          <w:i/>
+          <w:iCs/>
+          <w:sz w:val="20"/>
+          <w:szCs w:val="20"/>
+          <w:lang w:val="en-GB"/>
+        </w:rPr>
+        <w:t xml:space="preserve"> is also activated:</w:t>
+      </w:r>
+      <w:r>
+        <w:rPr>
+          <w:b/>
+          <w:bCs/>
+          <w:i/>
+          <w:iCs/>
+          <w:sz w:val="20"/>
+          <w:szCs w:val="20"/>
+          <w:lang w:val="en-GB"/>
+        </w:rPr>
         <w:br/>
       </w:r>
       <w:r>
@@ -5576,13 +6433,23 @@
           <w:lang w:val="en-GB"/>
         </w:rPr>
       </w:pPr>
-      <w:r>
-        <w:rPr>
-          <w:b/>
-          <w:bCs/>
-          <w:lang w:val="en-GB"/>
-        </w:rPr>
-        <w:t>MarkE -]</w:t>
+      <w:proofErr w:type="spellStart"/>
+      <w:r>
+        <w:rPr>
+          <w:b/>
+          <w:bCs/>
+          <w:lang w:val="en-GB"/>
+        </w:rPr>
+        <w:t>MarkE</w:t>
+      </w:r>
+      <w:proofErr w:type="spellEnd"/>
+      <w:r>
+        <w:rPr>
+          <w:b/>
+          <w:bCs/>
+          <w:lang w:val="en-GB"/>
+        </w:rPr>
+        <w:t xml:space="preserve"> -]</w:t>
       </w:r>
     </w:p>
     <w:p>
@@ -5629,8 +6496,9 @@
           <w:szCs w:val="20"/>
           <w:lang w:val="en-GB"/>
         </w:rPr>
-        <w:t>If AutoCutVideo+GPX is also activated:</w:t>
-      </w:r>
+        <w:t xml:space="preserve">If </w:t>
+      </w:r>
+      <w:proofErr w:type="spellStart"/>
       <w:r>
         <w:rPr>
           <w:b/>
@@ -5641,6 +6509,31 @@
           <w:szCs w:val="20"/>
           <w:lang w:val="en-GB"/>
         </w:rPr>
+        <w:t>AutoCutVideo+GPX</w:t>
+      </w:r>
+      <w:proofErr w:type="spellEnd"/>
+      <w:r>
+        <w:rPr>
+          <w:b/>
+          <w:bCs/>
+          <w:i/>
+          <w:iCs/>
+          <w:sz w:val="20"/>
+          <w:szCs w:val="20"/>
+          <w:lang w:val="en-GB"/>
+        </w:rPr>
+        <w:t xml:space="preserve"> is also activated:</w:t>
+      </w:r>
+      <w:r>
+        <w:rPr>
+          <w:b/>
+          <w:bCs/>
+          <w:i/>
+          <w:iCs/>
+          <w:sz w:val="20"/>
+          <w:szCs w:val="20"/>
+          <w:lang w:val="en-GB"/>
+        </w:rPr>
         <w:br/>
       </w:r>
       <w:r>
@@ -5685,7 +6578,35 @@
         <w:rPr>
           <w:lang w:val="en-GB"/>
         </w:rPr>
-        <w:t>Clears the selection for MarkB and MarkE.</w:t>
+        <w:t xml:space="preserve">Clears the selection for </w:t>
+      </w:r>
+      <w:proofErr w:type="spellStart"/>
+      <w:r>
+        <w:rPr>
+          <w:lang w:val="en-GB"/>
+        </w:rPr>
+        <w:t>MarkB</w:t>
+      </w:r>
+      <w:proofErr w:type="spellEnd"/>
+      <w:r>
+        <w:rPr>
+          <w:lang w:val="en-GB"/>
+        </w:rPr>
+        <w:t xml:space="preserve"> and </w:t>
+      </w:r>
+      <w:proofErr w:type="spellStart"/>
+      <w:r>
+        <w:rPr>
+          <w:lang w:val="en-GB"/>
+        </w:rPr>
+        <w:t>MarkE</w:t>
+      </w:r>
+      <w:proofErr w:type="spellEnd"/>
+      <w:r>
+        <w:rPr>
+          <w:lang w:val="en-GB"/>
+        </w:rPr>
+        <w:t>.</w:t>
       </w:r>
     </w:p>
     <w:p>
@@ -5736,7 +6657,21 @@
           <w:lang w:val="en-GB"/>
         </w:rPr>
         <w:br/>
-        <w:t>If AutoCutVideo+GPX is ON: The selected section in both the video and the GPX file is removed.</w:t>
+        <w:t xml:space="preserve">If </w:t>
+      </w:r>
+      <w:proofErr w:type="spellStart"/>
+      <w:r>
+        <w:rPr>
+          <w:lang w:val="en-GB"/>
+        </w:rPr>
+        <w:t>AutoCutVideo+GPX</w:t>
+      </w:r>
+      <w:proofErr w:type="spellEnd"/>
+      <w:r>
+        <w:rPr>
+          <w:lang w:val="en-GB"/>
+        </w:rPr>
+        <w:t xml:space="preserve"> is ON: The selected section in both the video and the GPX file is removed.</w:t>
       </w:r>
     </w:p>
     <w:p>
@@ -5797,13 +6732,23 @@
           <w:lang w:val="en-GB"/>
         </w:rPr>
       </w:pPr>
-      <w:r>
-        <w:rPr>
-          <w:b/>
-          <w:bCs/>
-          <w:lang w:val="en-GB"/>
-        </w:rPr>
-        <w:t xml:space="preserve">CutBegin </w:t>
+      <w:proofErr w:type="spellStart"/>
+      <w:r>
+        <w:rPr>
+          <w:b/>
+          <w:bCs/>
+          <w:lang w:val="en-GB"/>
+        </w:rPr>
+        <w:t>CutBegin</w:t>
+      </w:r>
+      <w:proofErr w:type="spellEnd"/>
+      <w:r>
+        <w:rPr>
+          <w:b/>
+          <w:bCs/>
+          <w:lang w:val="en-GB"/>
+        </w:rPr>
+        <w:t xml:space="preserve"> </w:t>
       </w:r>
     </w:p>
     <w:p>
@@ -5876,13 +6821,23 @@
           <w:lang w:val="en-GB"/>
         </w:rPr>
       </w:pPr>
-      <w:r>
-        <w:rPr>
-          <w:b/>
-          <w:bCs/>
-          <w:lang w:val="en-GB"/>
-        </w:rPr>
-        <w:t xml:space="preserve">CutEnd </w:t>
+      <w:proofErr w:type="spellStart"/>
+      <w:r>
+        <w:rPr>
+          <w:b/>
+          <w:bCs/>
+          <w:lang w:val="en-GB"/>
+        </w:rPr>
+        <w:t>CutEnd</w:t>
+      </w:r>
+      <w:proofErr w:type="spellEnd"/>
+      <w:r>
+        <w:rPr>
+          <w:b/>
+          <w:bCs/>
+          <w:lang w:val="en-GB"/>
+        </w:rPr>
+        <w:t xml:space="preserve"> </w:t>
       </w:r>
       <w:r>
         <w:rPr>
@@ -5951,30 +6906,87 @@
         <w:rPr>
           <w:lang w:val="en-US"/>
         </w:rPr>
-        <w:t>Allows to calculate the shift between video and gpx start. Find the matching gpx point corresponding to a video frame and click this button. Once set, the video and gpx edit (if video in edit mode) and selections are synchronized. New created points are inserted at time corresponding to current video time.</w:t>
-      </w:r>
-    </w:p>
-    <w:p>
-      <w:pPr>
+        <w:t xml:space="preserve">Allows to calculate the shift between video and </w:t>
+      </w:r>
+      <w:proofErr w:type="spellStart"/>
+      <w:r>
         <w:rPr>
           <w:lang w:val="en-US"/>
         </w:rPr>
-      </w:pPr>
+        <w:t>gpx</w:t>
+      </w:r>
+      <w:proofErr w:type="spellEnd"/>
       <w:r>
         <w:rPr>
           <w:lang w:val="en-US"/>
         </w:rPr>
-        <w:t xml:space="preserve">You can click this button again to edit the shift between gpx and video. </w:t>
-      </w:r>
-    </w:p>
-    <w:p>
-      <w:pPr>
-        <w:rPr>
-          <w:b/>
-          <w:bCs/>
-          <w:lang w:val="en-GB"/>
-        </w:rPr>
-      </w:pPr>
+        <w:t xml:space="preserve"> start. Find the matching </w:t>
+      </w:r>
+      <w:proofErr w:type="spellStart"/>
+      <w:r>
+        <w:rPr>
+          <w:lang w:val="en-US"/>
+        </w:rPr>
+        <w:t>gpx</w:t>
+      </w:r>
+      <w:proofErr w:type="spellEnd"/>
+      <w:r>
+        <w:rPr>
+          <w:lang w:val="en-US"/>
+        </w:rPr>
+        <w:t xml:space="preserve"> point corresponding to a video frame and click this button. Once set, the video and </w:t>
+      </w:r>
+      <w:proofErr w:type="spellStart"/>
+      <w:r>
+        <w:rPr>
+          <w:lang w:val="en-US"/>
+        </w:rPr>
+        <w:t>gpx</w:t>
+      </w:r>
+      <w:proofErr w:type="spellEnd"/>
+      <w:r>
+        <w:rPr>
+          <w:lang w:val="en-US"/>
+        </w:rPr>
+        <w:t xml:space="preserve"> edit (if video in edit mode) and selections are synchronized. New created points are inserted at time corresponding to current video time.</w:t>
+      </w:r>
+    </w:p>
+    <w:p>
+      <w:pPr>
+        <w:rPr>
+          <w:lang w:val="en-US"/>
+        </w:rPr>
+      </w:pPr>
+      <w:r>
+        <w:rPr>
+          <w:lang w:val="en-US"/>
+        </w:rPr>
+        <w:t xml:space="preserve">You can click this button again to edit the shift between </w:t>
+      </w:r>
+      <w:proofErr w:type="spellStart"/>
+      <w:r>
+        <w:rPr>
+          <w:lang w:val="en-US"/>
+        </w:rPr>
+        <w:t>gpx</w:t>
+      </w:r>
+      <w:proofErr w:type="spellEnd"/>
+      <w:r>
+        <w:rPr>
+          <w:lang w:val="en-US"/>
+        </w:rPr>
+        <w:t xml:space="preserve"> and video. </w:t>
+      </w:r>
+    </w:p>
+    <w:p>
+      <w:pPr>
+        <w:rPr>
+          <w:b/>
+          <w:bCs/>
+          <w:lang w:val="en-GB"/>
+        </w:rPr>
+      </w:pPr>
+      <w:proofErr w:type="spellStart"/>
       <w:r>
         <w:rPr>
           <w:b/>
@@ -5983,6 +6995,7 @@
         </w:rPr>
         <w:t>GSync</w:t>
       </w:r>
+      <w:proofErr w:type="spellEnd"/>
     </w:p>
     <w:p>
       <w:pPr>
@@ -5998,8 +7011,9 @@
           <w:szCs w:val="18"/>
           <w:lang w:val="en-GB"/>
         </w:rPr>
-        <w:t>Active only when gpx/video sync point is defined.</w:t>
-      </w:r>
+        <w:t xml:space="preserve">Active only when </w:t>
+      </w:r>
+      <w:proofErr w:type="spellStart"/>
       <w:r>
         <w:rPr>
           <w:i/>
@@ -6008,13 +7022,48 @@
           <w:szCs w:val="18"/>
           <w:lang w:val="en-GB"/>
         </w:rPr>
-        <w:br/>
-      </w:r>
-      <w:r>
-        <w:rPr>
-          <w:lang w:val="en-GB"/>
-        </w:rPr>
-        <w:t>Displays the corresponding GPX point for the current video position. This is useful for checking synchronization after making a cut. Set the video to a distinctive point (e.g., after a cut) and press GSync. The matching GPX point will be highlighted, allowing you to compare them. Recommendation:</w:t>
+        <w:t>gpx</w:t>
+      </w:r>
+      <w:proofErr w:type="spellEnd"/>
+      <w:r>
+        <w:rPr>
+          <w:i/>
+          <w:iCs/>
+          <w:sz w:val="18"/>
+          <w:szCs w:val="18"/>
+          <w:lang w:val="en-GB"/>
+        </w:rPr>
+        <w:t>/video sync point is defined.</w:t>
+      </w:r>
+      <w:r>
+        <w:rPr>
+          <w:i/>
+          <w:iCs/>
+          <w:sz w:val="18"/>
+          <w:szCs w:val="18"/>
+          <w:lang w:val="en-GB"/>
+        </w:rPr>
+        <w:br/>
+      </w:r>
+      <w:r>
+        <w:rPr>
+          <w:lang w:val="en-GB"/>
+        </w:rPr>
+        <w:t xml:space="preserve">Displays the corresponding GPX point for the current video position. This is useful for checking synchronization after making a cut. Set the video to a distinctive point (e.g., after a cut) and press </w:t>
+      </w:r>
+      <w:proofErr w:type="spellStart"/>
+      <w:r>
+        <w:rPr>
+          <w:lang w:val="en-GB"/>
+        </w:rPr>
+        <w:t>GSync</w:t>
+      </w:r>
+      <w:proofErr w:type="spellEnd"/>
+      <w:r>
+        <w:rPr>
+          <w:lang w:val="en-GB"/>
+        </w:rPr>
+        <w:t>. The matching GPX point will be highlighted, allowing you to compare them. Recommendation:</w:t>
       </w:r>
       <w:r>
         <w:rPr>
@@ -6036,13 +7085,23 @@
           <w:lang w:val="en-GB"/>
         </w:rPr>
       </w:pPr>
-      <w:r>
-        <w:rPr>
-          <w:b/>
-          <w:bCs/>
-          <w:lang w:val="en-GB"/>
-        </w:rPr>
-        <w:t>Ovl:</w:t>
+      <w:proofErr w:type="spellStart"/>
+      <w:r>
+        <w:rPr>
+          <w:b/>
+          <w:bCs/>
+          <w:lang w:val="en-GB"/>
+        </w:rPr>
+        <w:t>Ovl</w:t>
+      </w:r>
+      <w:proofErr w:type="spellEnd"/>
+      <w:r>
+        <w:rPr>
+          <w:b/>
+          <w:bCs/>
+          <w:lang w:val="en-GB"/>
+        </w:rPr>
+        <w:t>:</w:t>
       </w:r>
       <w:r>
         <w:rPr>
@@ -6122,11 +7181,43 @@
           <w:rFonts w:ascii="Segoe UI Symbol" w:hAnsi="Segoe UI Symbol" w:cs="Segoe UI Symbol"/>
           <w:lang w:val="en-GB"/>
         </w:rPr>
-        <w:t>Same as Confif Menu AutoCutVideo&amp;GPX On and Off</w:t>
-      </w:r>
+        <w:t xml:space="preserve">Same as </w:t>
+      </w:r>
+      <w:proofErr w:type="spellStart"/>
       <w:r>
         <w:rPr>
           <w:rFonts w:ascii="Segoe UI Symbol" w:hAnsi="Segoe UI Symbol" w:cs="Segoe UI Symbol"/>
+          <w:lang w:val="en-GB"/>
+        </w:rPr>
+        <w:t>Confif</w:t>
+      </w:r>
+      <w:proofErr w:type="spellEnd"/>
+      <w:r>
+        <w:rPr>
+          <w:rFonts w:ascii="Segoe UI Symbol" w:hAnsi="Segoe UI Symbol" w:cs="Segoe UI Symbol"/>
+          <w:lang w:val="en-GB"/>
+        </w:rPr>
+        <w:t xml:space="preserve"> Menu </w:t>
+      </w:r>
+      <w:proofErr w:type="spellStart"/>
+      <w:r>
+        <w:rPr>
+          <w:rFonts w:ascii="Segoe UI Symbol" w:hAnsi="Segoe UI Symbol" w:cs="Segoe UI Symbol"/>
+          <w:lang w:val="en-GB"/>
+        </w:rPr>
+        <w:t>AutoCutVideo&amp;GPX</w:t>
+      </w:r>
+      <w:proofErr w:type="spellEnd"/>
+      <w:r>
+        <w:rPr>
+          <w:rFonts w:ascii="Segoe UI Symbol" w:hAnsi="Segoe UI Symbol" w:cs="Segoe UI Symbol"/>
+          <w:lang w:val="en-GB"/>
+        </w:rPr>
+        <w:t xml:space="preserve"> On and Off</w:t>
+      </w:r>
+      <w:r>
+        <w:rPr>
+          <w:rFonts w:ascii="Segoe UI Symbol" w:hAnsi="Segoe UI Symbol" w:cs="Segoe UI Symbol"/>
           <w:b/>
           <w:bCs/>
           <w:lang w:val="en-GB"/>
@@ -6156,7 +7247,7 @@
       </w:pPr>
       <w:r>
         <w:pict w14:anchorId="657812EC">
-          <v:rect id="Rechteck 20" o:spid="_x0000_s1047" style="width:453.6pt;height:1.5pt;visibility:visible;mso-wrap-style:square;mso-left-percent:-10001;mso-top-percent:-10001;mso-position-horizontal:absolute;mso-position-horizontal-relative:char;mso-position-vertical:absolute;mso-position-vertical-relative:line;mso-left-percent:-10001;mso-top-percent:-10001;v-text-anchor:top" fillcolor="#a0a0a0" stroked="f" strokeweight="0">
+          <v:rect id="Rechteck 20" o:spid="_x0000_s1028" style="width:453.6pt;height:1.5pt;visibility:visible;mso-wrap-style:square;mso-left-percent:-10001;mso-top-percent:-10001;mso-position-horizontal:absolute;mso-position-horizontal-relative:char;mso-position-vertical:absolute;mso-position-vertical-relative:line;mso-left-percent:-10001;mso-top-percent:-10001;v-text-anchor:top" fillcolor="#a0a0a0" stroked="f" strokeweight="0">
             <w10:anchorlock/>
           </v:rect>
         </w:pict>
@@ -6610,7 +7701,21 @@
         <w:rPr>
           <w:lang w:val="en-GB"/>
         </w:rPr>
-        <w:t>If no API key is entered for services like MapBox, only OSM will be displayed. To access terrain maps, you must request an API key from the respective service provider.</w:t>
+        <w:t xml:space="preserve">If no API key is entered for services like </w:t>
+      </w:r>
+      <w:proofErr w:type="spellStart"/>
+      <w:r>
+        <w:rPr>
+          <w:lang w:val="en-GB"/>
+        </w:rPr>
+        <w:t>MapBox</w:t>
+      </w:r>
+      <w:proofErr w:type="spellEnd"/>
+      <w:r>
+        <w:rPr>
+          <w:lang w:val="en-GB"/>
+        </w:rPr>
+        <w:t>, only OSM will be displayed. To access terrain maps, you must request an API key from the respective service provider.</w:t>
       </w:r>
       <w:r>
         <w:rPr>
@@ -6725,7 +7830,21 @@
           <w:lang w:val="en-GB"/>
         </w:rPr>
         <w:br/>
-        <w:t>The "Bike" button toggles between Bike, Car, and Foot. Depending on the selected mode, the route will be requested and calculated accordingly via Mapbox.</w:t>
+        <w:t xml:space="preserve">The "Bike" button toggles between Bike, Car, and Foot. Depending on the selected mode, the route will be requested and calculated accordingly via </w:t>
+      </w:r>
+      <w:proofErr w:type="spellStart"/>
+      <w:r>
+        <w:rPr>
+          <w:lang w:val="en-GB"/>
+        </w:rPr>
+        <w:t>Mapbox</w:t>
+      </w:r>
+      <w:proofErr w:type="spellEnd"/>
+      <w:r>
+        <w:rPr>
+          <w:lang w:val="en-GB"/>
+        </w:rPr>
+        <w:t>.</w:t>
       </w:r>
     </w:p>
     <w:p>
@@ -6747,7 +7866,21 @@
           <w:lang w:val="en-GB"/>
         </w:rPr>
         <w:br/>
-        <w:t>First, you need to select either the first or the last point of the route by clicking on it. Then, activate the Directions function (its color will change). Using "Speed," you can define the spacing between points, and with the crosshair, you can set the target point where the route should lead. This can only be done at the beginning or end of a route!</w:t>
+        <w:t xml:space="preserve">First, you need to select either the first or the last point of the route by clicking on it. Then, activate the Directions function (its </w:t>
+      </w:r>
+      <w:proofErr w:type="spellStart"/>
+      <w:r>
+        <w:rPr>
+          <w:lang w:val="en-GB"/>
+        </w:rPr>
+        <w:t>color</w:t>
+      </w:r>
+      <w:proofErr w:type="spellEnd"/>
+      <w:r>
+        <w:rPr>
+          <w:lang w:val="en-GB"/>
+        </w:rPr>
+        <w:t xml:space="preserve"> will change). Using "Speed," you can define the spacing between points, and with the crosshair, you can set the target point where the route should lead. This can only be done at the beginning or end of a route!</w:t>
       </w:r>
     </w:p>
     <w:p>
@@ -6854,7 +7987,7 @@
       </w:pPr>
       <w:r>
         <w:pict w14:anchorId="52EDF649">
-          <v:rect id="Rechteck 26" o:spid="_x0000_s1046" style="width:453.6pt;height:1.5pt;visibility:visible;mso-wrap-style:square;mso-left-percent:-10001;mso-top-percent:-10001;mso-position-horizontal:absolute;mso-position-horizontal-relative:char;mso-position-vertical:absolute;mso-position-vertical-relative:line;mso-left-percent:-10001;mso-top-percent:-10001;v-text-anchor:top" fillcolor="#a0a0a0" stroked="f" strokeweight="0">
+          <v:rect id="Rechteck 26" o:spid="_x0000_s1027" style="width:453.6pt;height:1.5pt;visibility:visible;mso-wrap-style:square;mso-left-percent:-10001;mso-top-percent:-10001;mso-position-horizontal:absolute;mso-position-horizontal-relative:char;mso-position-vertical:absolute;mso-position-vertical-relative:line;mso-left-percent:-10001;mso-top-percent:-10001;v-text-anchor:top" fillcolor="#a0a0a0" stroked="f" strokeweight="0">
             <w10:anchorlock/>
           </v:rect>
         </w:pict>
@@ -7033,72 +8166,201 @@
           <w:lang w:val="en-GB"/>
         </w:rPr>
         <w:br/>
-        <w:t xml:space="preserve">markB – markE – Deselect [x] – Delete – chTime – chElevation – chSlope – More (…) –  Smooth </w:t>
-      </w:r>
-    </w:p>
-    <w:p>
-      <w:pPr>
-        <w:rPr>
-          <w:lang w:val="en-GB"/>
-        </w:rPr>
-      </w:pPr>
-    </w:p>
-    <w:p>
-      <w:pPr>
-        <w:rPr>
-          <w:lang w:val="en-GB"/>
-        </w:rPr>
-      </w:pPr>
-      <w:r>
-        <w:rPr>
-          <w:b/>
-          <w:bCs/>
+      </w:r>
+      <w:proofErr w:type="spellStart"/>
+      <w:r>
+        <w:rPr>
           <w:lang w:val="en-GB"/>
         </w:rPr>
         <w:t>markB</w:t>
       </w:r>
-      <w:r>
-        <w:rPr>
-          <w:b/>
-          <w:bCs/>
-          <w:lang w:val="en-GB"/>
-        </w:rPr>
-        <w:br/>
-      </w:r>
-      <w:r>
-        <w:rPr>
-          <w:lang w:val="en-GB"/>
-        </w:rPr>
-        <w:t>Marks the beginning of a cut in the GPX list. The marked section will be highlighted in red in both the GPX list and the map. The button turns red when activated.To delete a single point, simply mark it with markB.</w:t>
-      </w:r>
-    </w:p>
-    <w:p>
-      <w:pPr>
-        <w:rPr>
-          <w:lang w:val="en-GB"/>
-        </w:rPr>
-      </w:pPr>
-      <w:r>
-        <w:rPr>
-          <w:b/>
-          <w:bCs/>
+      <w:proofErr w:type="spellEnd"/>
+      <w:r>
+        <w:rPr>
+          <w:lang w:val="en-GB"/>
+        </w:rPr>
+        <w:t xml:space="preserve"> – </w:t>
+      </w:r>
+      <w:proofErr w:type="spellStart"/>
+      <w:r>
+        <w:rPr>
           <w:lang w:val="en-GB"/>
         </w:rPr>
         <w:t>markE</w:t>
       </w:r>
-      <w:r>
-        <w:rPr>
-          <w:b/>
-          <w:bCs/>
-          <w:lang w:val="en-GB"/>
-        </w:rPr>
-        <w:br/>
-      </w:r>
-      <w:r>
-        <w:rPr>
-          <w:lang w:val="en-GB"/>
-        </w:rPr>
-        <w:t>Marks the end of a cut in the GPX list. The entire section between markB and markE will be highlighted in red in both the GPX list and the map.</w:t>
+      <w:proofErr w:type="spellEnd"/>
+      <w:r>
+        <w:rPr>
+          <w:lang w:val="en-GB"/>
+        </w:rPr>
+        <w:t xml:space="preserve"> – Deselect [x] – Delete – </w:t>
+      </w:r>
+      <w:proofErr w:type="spellStart"/>
+      <w:r>
+        <w:rPr>
+          <w:lang w:val="en-GB"/>
+        </w:rPr>
+        <w:t>chTime</w:t>
+      </w:r>
+      <w:proofErr w:type="spellEnd"/>
+      <w:r>
+        <w:rPr>
+          <w:lang w:val="en-GB"/>
+        </w:rPr>
+        <w:t xml:space="preserve"> – </w:t>
+      </w:r>
+      <w:proofErr w:type="spellStart"/>
+      <w:r>
+        <w:rPr>
+          <w:lang w:val="en-GB"/>
+        </w:rPr>
+        <w:t>chElevation</w:t>
+      </w:r>
+      <w:proofErr w:type="spellEnd"/>
+      <w:r>
+        <w:rPr>
+          <w:lang w:val="en-GB"/>
+        </w:rPr>
+        <w:t xml:space="preserve"> – </w:t>
+      </w:r>
+      <w:proofErr w:type="spellStart"/>
+      <w:r>
+        <w:rPr>
+          <w:lang w:val="en-GB"/>
+        </w:rPr>
+        <w:t>chSlope</w:t>
+      </w:r>
+      <w:proofErr w:type="spellEnd"/>
+      <w:r>
+        <w:rPr>
+          <w:lang w:val="en-GB"/>
+        </w:rPr>
+        <w:t xml:space="preserve"> – More (…) –  Smooth </w:t>
+      </w:r>
+    </w:p>
+    <w:p>
+      <w:pPr>
+        <w:rPr>
+          <w:lang w:val="en-GB"/>
+        </w:rPr>
+      </w:pPr>
+    </w:p>
+    <w:p>
+      <w:pPr>
+        <w:rPr>
+          <w:lang w:val="en-GB"/>
+        </w:rPr>
+      </w:pPr>
+      <w:proofErr w:type="spellStart"/>
+      <w:r>
+        <w:rPr>
+          <w:b/>
+          <w:bCs/>
+          <w:lang w:val="en-GB"/>
+        </w:rPr>
+        <w:t>markB</w:t>
+      </w:r>
+      <w:proofErr w:type="spellEnd"/>
+      <w:r>
+        <w:rPr>
+          <w:b/>
+          <w:bCs/>
+          <w:lang w:val="en-GB"/>
+        </w:rPr>
+        <w:br/>
+      </w:r>
+      <w:r>
+        <w:rPr>
+          <w:lang w:val="en-GB"/>
+        </w:rPr>
+        <w:t xml:space="preserve">Marks the beginning of a cut in the GPX list. The marked section will be highlighted in red in both the GPX list and the map. The button turns red when </w:t>
+      </w:r>
+      <w:proofErr w:type="spellStart"/>
+      <w:r>
+        <w:rPr>
+          <w:lang w:val="en-GB"/>
+        </w:rPr>
+        <w:t>activated.To</w:t>
+      </w:r>
+      <w:proofErr w:type="spellEnd"/>
+      <w:r>
+        <w:rPr>
+          <w:lang w:val="en-GB"/>
+        </w:rPr>
+        <w:t xml:space="preserve"> delete a single point, simply mark it with </w:t>
+      </w:r>
+      <w:proofErr w:type="spellStart"/>
+      <w:r>
+        <w:rPr>
+          <w:lang w:val="en-GB"/>
+        </w:rPr>
+        <w:t>markB</w:t>
+      </w:r>
+      <w:proofErr w:type="spellEnd"/>
+      <w:r>
+        <w:rPr>
+          <w:lang w:val="en-GB"/>
+        </w:rPr>
+        <w:t>.</w:t>
+      </w:r>
+    </w:p>
+    <w:p>
+      <w:pPr>
+        <w:rPr>
+          <w:lang w:val="en-GB"/>
+        </w:rPr>
+      </w:pPr>
+      <w:proofErr w:type="spellStart"/>
+      <w:r>
+        <w:rPr>
+          <w:b/>
+          <w:bCs/>
+          <w:lang w:val="en-GB"/>
+        </w:rPr>
+        <w:t>markE</w:t>
+      </w:r>
+      <w:proofErr w:type="spellEnd"/>
+      <w:r>
+        <w:rPr>
+          <w:b/>
+          <w:bCs/>
+          <w:lang w:val="en-GB"/>
+        </w:rPr>
+        <w:br/>
+      </w:r>
+      <w:r>
+        <w:rPr>
+          <w:lang w:val="en-GB"/>
+        </w:rPr>
+        <w:t xml:space="preserve">Marks the end of a cut in the GPX list. The entire section between </w:t>
+      </w:r>
+      <w:proofErr w:type="spellStart"/>
+      <w:r>
+        <w:rPr>
+          <w:lang w:val="en-GB"/>
+        </w:rPr>
+        <w:t>markB</w:t>
+      </w:r>
+      <w:proofErr w:type="spellEnd"/>
+      <w:r>
+        <w:rPr>
+          <w:lang w:val="en-GB"/>
+        </w:rPr>
+        <w:t xml:space="preserve"> and </w:t>
+      </w:r>
+      <w:proofErr w:type="spellStart"/>
+      <w:r>
+        <w:rPr>
+          <w:lang w:val="en-GB"/>
+        </w:rPr>
+        <w:t>markE</w:t>
+      </w:r>
+      <w:proofErr w:type="spellEnd"/>
+      <w:r>
+        <w:rPr>
+          <w:lang w:val="en-GB"/>
+        </w:rPr>
+        <w:t xml:space="preserve"> will be highlighted in red in both the GPX list and the map.</w:t>
       </w:r>
     </w:p>
     <w:p>
@@ -7217,13 +8479,41 @@
           <w:lang w:val="en-GB"/>
         </w:rPr>
       </w:pPr>
-      <w:r>
-        <w:rPr>
-          <w:b/>
-          <w:bCs/>
-          <w:lang w:val="en-GB"/>
-        </w:rPr>
-        <w:t>chT (chTime)</w:t>
+      <w:proofErr w:type="spellStart"/>
+      <w:r>
+        <w:rPr>
+          <w:b/>
+          <w:bCs/>
+          <w:lang w:val="en-GB"/>
+        </w:rPr>
+        <w:t>chT</w:t>
+      </w:r>
+      <w:proofErr w:type="spellEnd"/>
+      <w:r>
+        <w:rPr>
+          <w:b/>
+          <w:bCs/>
+          <w:lang w:val="en-GB"/>
+        </w:rPr>
+        <w:t xml:space="preserve"> (</w:t>
+      </w:r>
+      <w:proofErr w:type="spellStart"/>
+      <w:r>
+        <w:rPr>
+          <w:b/>
+          <w:bCs/>
+          <w:lang w:val="en-GB"/>
+        </w:rPr>
+        <w:t>chTime</w:t>
+      </w:r>
+      <w:proofErr w:type="spellEnd"/>
+      <w:r>
+        <w:rPr>
+          <w:b/>
+          <w:bCs/>
+          <w:lang w:val="en-GB"/>
+        </w:rPr>
+        <w:t>)</w:t>
       </w:r>
       <w:r>
         <w:rPr>
@@ -7253,13 +8543,41 @@
           <w:lang w:val="en-GB"/>
         </w:rPr>
       </w:pPr>
-      <w:r>
-        <w:rPr>
-          <w:b/>
-          <w:bCs/>
-          <w:lang w:val="en-GB"/>
-        </w:rPr>
-        <w:t xml:space="preserve">chEle (chElevation) </w:t>
+      <w:proofErr w:type="spellStart"/>
+      <w:r>
+        <w:rPr>
+          <w:b/>
+          <w:bCs/>
+          <w:lang w:val="en-GB"/>
+        </w:rPr>
+        <w:t>chEle</w:t>
+      </w:r>
+      <w:proofErr w:type="spellEnd"/>
+      <w:r>
+        <w:rPr>
+          <w:b/>
+          <w:bCs/>
+          <w:lang w:val="en-GB"/>
+        </w:rPr>
+        <w:t xml:space="preserve"> (</w:t>
+      </w:r>
+      <w:proofErr w:type="spellStart"/>
+      <w:r>
+        <w:rPr>
+          <w:b/>
+          <w:bCs/>
+          <w:lang w:val="en-GB"/>
+        </w:rPr>
+        <w:t>chElevation</w:t>
+      </w:r>
+      <w:proofErr w:type="spellEnd"/>
+      <w:r>
+        <w:rPr>
+          <w:b/>
+          <w:bCs/>
+          <w:lang w:val="en-GB"/>
+        </w:rPr>
+        <w:t xml:space="preserve">) </w:t>
       </w:r>
       <w:r>
         <w:rPr>
@@ -7297,7 +8615,25 @@
           <w:bCs/>
           <w:lang w:val="en-GB"/>
         </w:rPr>
-        <w:t xml:space="preserve"> (chSlope)</w:t>
+        <w:t xml:space="preserve"> (</w:t>
+      </w:r>
+      <w:proofErr w:type="spellStart"/>
+      <w:r>
+        <w:rPr>
+          <w:b/>
+          <w:bCs/>
+          <w:lang w:val="en-GB"/>
+        </w:rPr>
+        <w:t>chSlope</w:t>
+      </w:r>
+      <w:proofErr w:type="spellEnd"/>
+      <w:r>
+        <w:rPr>
+          <w:b/>
+          <w:bCs/>
+          <w:lang w:val="en-GB"/>
+        </w:rPr>
+        <w:t>)</w:t>
       </w:r>
       <w:r>
         <w:rPr>
@@ -7440,7 +8776,21 @@
         <w:rPr>
           <w:lang w:val="en-GB"/>
         </w:rPr>
-        <w:t>Opens a smoothing settings window, where adjustments can be made to smooth the elevation profile. Default settings usually provide a good result.If the result is not satisfactory, the options can be adjusted: Box-Smoothing: Number of GPX points included in the smoothing process. Flatten-Value: Maximum slope difference between points.</w:t>
+        <w:t xml:space="preserve">Opens a smoothing settings window, where adjustments can be made to smooth the elevation profile. Default settings usually provide a good </w:t>
+      </w:r>
+      <w:proofErr w:type="spellStart"/>
+      <w:r>
+        <w:rPr>
+          <w:lang w:val="en-GB"/>
+        </w:rPr>
+        <w:t>result.If</w:t>
+      </w:r>
+      <w:proofErr w:type="spellEnd"/>
+      <w:r>
+        <w:rPr>
+          <w:lang w:val="en-GB"/>
+        </w:rPr>
+        <w:t xml:space="preserve"> the result is not satisfactory, the options can be adjusted: Box-Smoothing: Number of GPX points included in the smoothing process. Flatten-Value: Maximum slope difference between points.</w:t>
       </w:r>
       <w:r>
         <w:rPr>
@@ -7561,7 +8911,23 @@
           <w:b/>
           <w:lang w:val="en-GB"/>
         </w:rPr>
-        <w:t>More-Menü […]:</w:t>
+        <w:t>More-</w:t>
+      </w:r>
+      <w:proofErr w:type="spellStart"/>
+      <w:r>
+        <w:rPr>
+          <w:b/>
+          <w:lang w:val="en-GB"/>
+        </w:rPr>
+        <w:t>Menü</w:t>
+      </w:r>
+      <w:proofErr w:type="spellEnd"/>
+      <w:r>
+        <w:rPr>
+          <w:b/>
+          <w:lang w:val="en-GB"/>
+        </w:rPr>
+        <w:t xml:space="preserve"> […]:</w:t>
       </w:r>
     </w:p>
     <w:p>
@@ -7702,7 +9068,23 @@
           <w:bCs/>
           <w:lang w:val="en-GB"/>
         </w:rPr>
-        <w:t xml:space="preserve">Fills in missing GPX points. Example: You drive through a tunnel or an area without GPS coverage.The GPX file shows an unusually large time step, and the chart displays it as a pause (since the step is greater than 1s). Cause: GPS signal failure. </w:t>
+        <w:t xml:space="preserve">Fills in missing GPX points. Example: You drive through a tunnel or an area without GPS </w:t>
+      </w:r>
+      <w:proofErr w:type="spellStart"/>
+      <w:r>
+        <w:rPr>
+          <w:bCs/>
+          <w:lang w:val="en-GB"/>
+        </w:rPr>
+        <w:t>coverage.The</w:t>
+      </w:r>
+      <w:proofErr w:type="spellEnd"/>
+      <w:r>
+        <w:rPr>
+          <w:bCs/>
+          <w:lang w:val="en-GB"/>
+        </w:rPr>
+        <w:t xml:space="preserve"> GPX file shows an unusually large time step, and the chart displays it as a pause (since the step is greater than 1s). Cause: GPS signal failure. </w:t>
       </w:r>
       <w:r>
         <w:rPr>
@@ -7734,11 +9116,33 @@
         </w:rPr>
         <w:t xml:space="preserve">Important: </w:t>
       </w:r>
-      <w:r>
-        <w:rPr>
-          <w:lang w:val="en-GB"/>
-        </w:rPr>
-        <w:t>markB must be set before the gap. markE must be set after the gap.</w:t>
+      <w:proofErr w:type="spellStart"/>
+      <w:r>
+        <w:rPr>
+          <w:lang w:val="en-GB"/>
+        </w:rPr>
+        <w:t>markB</w:t>
+      </w:r>
+      <w:proofErr w:type="spellEnd"/>
+      <w:r>
+        <w:rPr>
+          <w:lang w:val="en-GB"/>
+        </w:rPr>
+        <w:t xml:space="preserve"> must be set before the gap. </w:t>
+      </w:r>
+      <w:proofErr w:type="spellStart"/>
+      <w:r>
+        <w:rPr>
+          <w:lang w:val="en-GB"/>
+        </w:rPr>
+        <w:t>markE</w:t>
+      </w:r>
+      <w:proofErr w:type="spellEnd"/>
+      <w:r>
+        <w:rPr>
+          <w:lang w:val="en-GB"/>
+        </w:rPr>
+        <w:t xml:space="preserve"> must be set after the gap.</w:t>
       </w:r>
     </w:p>
     <w:p>
@@ -7769,65 +9173,147 @@
         <w:rPr>
           <w:lang w:val="en-GB"/>
         </w:rPr>
-        <w:t>When Directions is activated, GPX points are no longer simply connected in a straight line from markB to markE. Instead, you can let Mapbox draw the route along the road.</w:t>
-      </w:r>
-    </w:p>
-    <w:p>
-      <w:pPr>
-        <w:rPr>
-          <w:lang w:val="en-GB"/>
-        </w:rPr>
-      </w:pPr>
-    </w:p>
-    <w:p>
-      <w:pPr>
-        <w:rPr>
-          <w:lang w:val="en-GB"/>
-        </w:rPr>
-      </w:pPr>
-    </w:p>
-    <w:p>
-      <w:pPr>
-        <w:rPr>
-          <w:bCs/>
-          <w:lang w:val="en-GB"/>
-        </w:rPr>
-      </w:pPr>
-    </w:p>
-    <w:p>
-      <w:pPr>
-        <w:rPr>
-          <w:lang w:val="en-GB"/>
-        </w:rPr>
-      </w:pPr>
-      <w:r>
-        <w:rPr>
-          <w:b/>
-          <w:bCs/>
-          <w:lang w:val="en-GB"/>
-        </w:rPr>
-        <w:t>Delete WayErrors</w:t>
-      </w:r>
-      <w:r>
-        <w:rPr>
-          <w:b/>
-          <w:bCs/>
-          <w:lang w:val="en-GB"/>
-        </w:rPr>
-        <w:br/>
-      </w:r>
-      <w:r>
-        <w:rPr>
-          <w:bCs/>
-          <w:lang w:val="en-GB"/>
-        </w:rPr>
-        <w:t xml:space="preserve">When loading a GPX file, you will receive a warning if WayErrors are found. These errors are also highlighted in red in the chart. This button fixes these errors automatically. </w:t>
-      </w:r>
-      <w:r>
-        <w:rPr>
-          <w:lang w:val="en-GB"/>
-        </w:rPr>
-        <w:t>What are WayErrors? These are GPX points that have identical latitude/longitude but a 1s time step—a recording error. Fixing the error recalculates the second point: It is moved to the middle between the previous and next point while keeping the same latitude/longitude.</w:t>
+        <w:t xml:space="preserve">When Directions is activated, GPX points are no longer simply connected in a straight line from </w:t>
+      </w:r>
+      <w:proofErr w:type="spellStart"/>
+      <w:r>
+        <w:rPr>
+          <w:lang w:val="en-GB"/>
+        </w:rPr>
+        <w:t>markB</w:t>
+      </w:r>
+      <w:proofErr w:type="spellEnd"/>
+      <w:r>
+        <w:rPr>
+          <w:lang w:val="en-GB"/>
+        </w:rPr>
+        <w:t xml:space="preserve"> to </w:t>
+      </w:r>
+      <w:proofErr w:type="spellStart"/>
+      <w:r>
+        <w:rPr>
+          <w:lang w:val="en-GB"/>
+        </w:rPr>
+        <w:t>markE</w:t>
+      </w:r>
+      <w:proofErr w:type="spellEnd"/>
+      <w:r>
+        <w:rPr>
+          <w:lang w:val="en-GB"/>
+        </w:rPr>
+        <w:t xml:space="preserve">. Instead, you can let </w:t>
+      </w:r>
+      <w:proofErr w:type="spellStart"/>
+      <w:r>
+        <w:rPr>
+          <w:lang w:val="en-GB"/>
+        </w:rPr>
+        <w:t>Mapbox</w:t>
+      </w:r>
+      <w:proofErr w:type="spellEnd"/>
+      <w:r>
+        <w:rPr>
+          <w:lang w:val="en-GB"/>
+        </w:rPr>
+        <w:t xml:space="preserve"> draw the route along the road.</w:t>
+      </w:r>
+    </w:p>
+    <w:p>
+      <w:pPr>
+        <w:rPr>
+          <w:lang w:val="en-GB"/>
+        </w:rPr>
+      </w:pPr>
+    </w:p>
+    <w:p>
+      <w:pPr>
+        <w:rPr>
+          <w:lang w:val="en-GB"/>
+        </w:rPr>
+      </w:pPr>
+    </w:p>
+    <w:p>
+      <w:pPr>
+        <w:rPr>
+          <w:bCs/>
+          <w:lang w:val="en-GB"/>
+        </w:rPr>
+      </w:pPr>
+    </w:p>
+    <w:p>
+      <w:pPr>
+        <w:rPr>
+          <w:lang w:val="en-GB"/>
+        </w:rPr>
+      </w:pPr>
+      <w:r>
+        <w:rPr>
+          <w:b/>
+          <w:bCs/>
+          <w:lang w:val="en-GB"/>
+        </w:rPr>
+        <w:t xml:space="preserve">Delete </w:t>
+      </w:r>
+      <w:proofErr w:type="spellStart"/>
+      <w:r>
+        <w:rPr>
+          <w:b/>
+          <w:bCs/>
+          <w:lang w:val="en-GB"/>
+        </w:rPr>
+        <w:t>WayErrors</w:t>
+      </w:r>
+      <w:proofErr w:type="spellEnd"/>
+      <w:r>
+        <w:rPr>
+          <w:b/>
+          <w:bCs/>
+          <w:lang w:val="en-GB"/>
+        </w:rPr>
+        <w:br/>
+      </w:r>
+      <w:r>
+        <w:rPr>
+          <w:bCs/>
+          <w:lang w:val="en-GB"/>
+        </w:rPr>
+        <w:t xml:space="preserve">When loading a GPX file, you will receive a warning if </w:t>
+      </w:r>
+      <w:proofErr w:type="spellStart"/>
+      <w:r>
+        <w:rPr>
+          <w:bCs/>
+          <w:lang w:val="en-GB"/>
+        </w:rPr>
+        <w:t>WayErrors</w:t>
+      </w:r>
+      <w:proofErr w:type="spellEnd"/>
+      <w:r>
+        <w:rPr>
+          <w:bCs/>
+          <w:lang w:val="en-GB"/>
+        </w:rPr>
+        <w:t xml:space="preserve"> are found. These errors are also highlighted in red in the chart. This button fixes these errors automatically. </w:t>
+      </w:r>
+      <w:r>
+        <w:rPr>
+          <w:lang w:val="en-GB"/>
+        </w:rPr>
+        <w:t xml:space="preserve">What are </w:t>
+      </w:r>
+      <w:proofErr w:type="spellStart"/>
+      <w:r>
+        <w:rPr>
+          <w:lang w:val="en-GB"/>
+        </w:rPr>
+        <w:t>WayErrors</w:t>
+      </w:r>
+      <w:proofErr w:type="spellEnd"/>
+      <w:r>
+        <w:rPr>
+          <w:lang w:val="en-GB"/>
+        </w:rPr>
+        <w:t>? These are GPX points that have identical latitude/longitude but a 1s time step—a recording error. Fixing the error recalculates the second point: It is moved to the middle between the previous and next point while keeping the same latitude/longitude.</w:t>
       </w:r>
     </w:p>
     <w:p>
@@ -7882,7 +9368,21 @@
         <w:rPr>
           <w:lang w:val="en-GB"/>
         </w:rPr>
-        <w:t>This issue is rare, but some GPX points might have a 0s time step.These points are simply deleted.</w:t>
+        <w:t xml:space="preserve">This issue is rare, but some GPX points might have a 0s time </w:t>
+      </w:r>
+      <w:proofErr w:type="spellStart"/>
+      <w:r>
+        <w:rPr>
+          <w:lang w:val="en-GB"/>
+        </w:rPr>
+        <w:t>step.These</w:t>
+      </w:r>
+      <w:proofErr w:type="spellEnd"/>
+      <w:r>
+        <w:rPr>
+          <w:lang w:val="en-GB"/>
+        </w:rPr>
+        <w:t xml:space="preserve"> points are simply deleted.</w:t>
       </w:r>
     </w:p>
     <w:p>
@@ -7923,53 +9423,105 @@
           <w:bCs/>
           <w:lang w:val="en-GB"/>
         </w:rPr>
-        <w:t>Cut all before markB</w:t>
-      </w:r>
-      <w:r>
-        <w:rPr>
-          <w:b/>
-          <w:bCs/>
-          <w:lang w:val="en-GB"/>
-        </w:rPr>
-        <w:br/>
-      </w:r>
-      <w:r>
-        <w:rPr>
-          <w:bCs/>
-          <w:lang w:val="en-GB"/>
-        </w:rPr>
-        <w:t>Deletes all GPX points before and including the markB point.</w:t>
-      </w:r>
-    </w:p>
-    <w:p>
-      <w:pPr>
-        <w:rPr>
-          <w:bCs/>
-          <w:lang w:val="en-GB"/>
-        </w:rPr>
-      </w:pPr>
-      <w:r>
-        <w:rPr>
-          <w:b/>
-          <w:bCs/>
-          <w:lang w:val="en-GB"/>
-        </w:rPr>
-        <w:t>Cut all after markB</w:t>
-      </w:r>
-      <w:r>
-        <w:rPr>
-          <w:b/>
-          <w:bCs/>
-          <w:lang w:val="en-GB"/>
-        </w:rPr>
-        <w:br/>
-      </w:r>
-      <w:r>
-        <w:rPr>
-          <w:bCs/>
-          <w:lang w:val="en-GB"/>
-        </w:rPr>
-        <w:t>Deletes all GPX points after and including the markB point.</w:t>
+        <w:t xml:space="preserve">Cut all before </w:t>
+      </w:r>
+      <w:proofErr w:type="spellStart"/>
+      <w:r>
+        <w:rPr>
+          <w:b/>
+          <w:bCs/>
+          <w:lang w:val="en-GB"/>
+        </w:rPr>
+        <w:t>markB</w:t>
+      </w:r>
+      <w:proofErr w:type="spellEnd"/>
+      <w:r>
+        <w:rPr>
+          <w:b/>
+          <w:bCs/>
+          <w:lang w:val="en-GB"/>
+        </w:rPr>
+        <w:br/>
+      </w:r>
+      <w:r>
+        <w:rPr>
+          <w:bCs/>
+          <w:lang w:val="en-GB"/>
+        </w:rPr>
+        <w:t xml:space="preserve">Deletes all GPX points before and including the </w:t>
+      </w:r>
+      <w:proofErr w:type="spellStart"/>
+      <w:r>
+        <w:rPr>
+          <w:bCs/>
+          <w:lang w:val="en-GB"/>
+        </w:rPr>
+        <w:t>markB</w:t>
+      </w:r>
+      <w:proofErr w:type="spellEnd"/>
+      <w:r>
+        <w:rPr>
+          <w:bCs/>
+          <w:lang w:val="en-GB"/>
+        </w:rPr>
+        <w:t xml:space="preserve"> point.</w:t>
+      </w:r>
+    </w:p>
+    <w:p>
+      <w:pPr>
+        <w:rPr>
+          <w:bCs/>
+          <w:lang w:val="en-GB"/>
+        </w:rPr>
+      </w:pPr>
+      <w:r>
+        <w:rPr>
+          <w:b/>
+          <w:bCs/>
+          <w:lang w:val="en-GB"/>
+        </w:rPr>
+        <w:t xml:space="preserve">Cut all after </w:t>
+      </w:r>
+      <w:proofErr w:type="spellStart"/>
+      <w:r>
+        <w:rPr>
+          <w:b/>
+          <w:bCs/>
+          <w:lang w:val="en-GB"/>
+        </w:rPr>
+        <w:t>markB</w:t>
+      </w:r>
+      <w:proofErr w:type="spellEnd"/>
+      <w:r>
+        <w:rPr>
+          <w:b/>
+          <w:bCs/>
+          <w:lang w:val="en-GB"/>
+        </w:rPr>
+        <w:br/>
+      </w:r>
+      <w:r>
+        <w:rPr>
+          <w:bCs/>
+          <w:lang w:val="en-GB"/>
+        </w:rPr>
+        <w:t xml:space="preserve">Deletes all GPX points after and including the </w:t>
+      </w:r>
+      <w:proofErr w:type="spellStart"/>
+      <w:r>
+        <w:rPr>
+          <w:bCs/>
+          <w:lang w:val="en-GB"/>
+        </w:rPr>
+        <w:t>markB</w:t>
+      </w:r>
+      <w:proofErr w:type="spellEnd"/>
+      <w:r>
+        <w:rPr>
+          <w:bCs/>
+          <w:lang w:val="en-GB"/>
+        </w:rPr>
+        <w:t xml:space="preserve"> point.</w:t>
       </w:r>
     </w:p>
     <w:p>
@@ -8072,11 +9624,19 @@
           <w:lang w:val="en-GB"/>
         </w:rPr>
       </w:pPr>
-      <w:r>
-        <w:rPr>
-          <w:lang w:val="en-GB"/>
-        </w:rPr>
-        <w:t>AutoCutVideo &amp; GPX = OFF</w:t>
+      <w:proofErr w:type="spellStart"/>
+      <w:r>
+        <w:rPr>
+          <w:lang w:val="en-GB"/>
+        </w:rPr>
+        <w:t>AutoCutVideo</w:t>
+      </w:r>
+      <w:proofErr w:type="spellEnd"/>
+      <w:r>
+        <w:rPr>
+          <w:lang w:val="en-GB"/>
+        </w:rPr>
+        <w:t xml:space="preserve"> &amp; GPX = OFF</w:t>
       </w:r>
     </w:p>
     <w:p>
@@ -8106,7 +9666,49 @@
         <w:rPr>
           <w:lang w:val="en-GB"/>
         </w:rPr>
-        <w:t>Set the start point markB in Video_Control using markB.</w:t>
+        <w:t xml:space="preserve">Set the start point </w:t>
+      </w:r>
+      <w:proofErr w:type="spellStart"/>
+      <w:r>
+        <w:rPr>
+          <w:lang w:val="en-GB"/>
+        </w:rPr>
+        <w:t>markB</w:t>
+      </w:r>
+      <w:proofErr w:type="spellEnd"/>
+      <w:r>
+        <w:rPr>
+          <w:lang w:val="en-GB"/>
+        </w:rPr>
+        <w:t xml:space="preserve"> in </w:t>
+      </w:r>
+      <w:proofErr w:type="spellStart"/>
+      <w:r>
+        <w:rPr>
+          <w:lang w:val="en-GB"/>
+        </w:rPr>
+        <w:t>Video_Control</w:t>
+      </w:r>
+      <w:proofErr w:type="spellEnd"/>
+      <w:r>
+        <w:rPr>
+          <w:lang w:val="en-GB"/>
+        </w:rPr>
+        <w:t xml:space="preserve"> using </w:t>
+      </w:r>
+      <w:proofErr w:type="spellStart"/>
+      <w:r>
+        <w:rPr>
+          <w:lang w:val="en-GB"/>
+        </w:rPr>
+        <w:t>markB</w:t>
+      </w:r>
+      <w:proofErr w:type="spellEnd"/>
+      <w:r>
+        <w:rPr>
+          <w:lang w:val="en-GB"/>
+        </w:rPr>
+        <w:t>.</w:t>
       </w:r>
     </w:p>
     <w:p>
@@ -8123,7 +9725,49 @@
         <w:rPr>
           <w:lang w:val="en-GB"/>
         </w:rPr>
-        <w:t>Use GSync to select the corresponding GPX point with markB in GPX_Control.</w:t>
+        <w:t xml:space="preserve">Use </w:t>
+      </w:r>
+      <w:proofErr w:type="spellStart"/>
+      <w:r>
+        <w:rPr>
+          <w:lang w:val="en-GB"/>
+        </w:rPr>
+        <w:t>GSync</w:t>
+      </w:r>
+      <w:proofErr w:type="spellEnd"/>
+      <w:r>
+        <w:rPr>
+          <w:lang w:val="en-GB"/>
+        </w:rPr>
+        <w:t xml:space="preserve"> to select the corresponding GPX point with </w:t>
+      </w:r>
+      <w:proofErr w:type="spellStart"/>
+      <w:r>
+        <w:rPr>
+          <w:lang w:val="en-GB"/>
+        </w:rPr>
+        <w:t>markB</w:t>
+      </w:r>
+      <w:proofErr w:type="spellEnd"/>
+      <w:r>
+        <w:rPr>
+          <w:lang w:val="en-GB"/>
+        </w:rPr>
+        <w:t xml:space="preserve"> in </w:t>
+      </w:r>
+      <w:proofErr w:type="spellStart"/>
+      <w:r>
+        <w:rPr>
+          <w:lang w:val="en-GB"/>
+        </w:rPr>
+        <w:t>GPX_Control</w:t>
+      </w:r>
+      <w:proofErr w:type="spellEnd"/>
+      <w:r>
+        <w:rPr>
+          <w:lang w:val="en-GB"/>
+        </w:rPr>
+        <w:t>.</w:t>
       </w:r>
     </w:p>
     <w:p>
@@ -8140,7 +9784,21 @@
         <w:rPr>
           <w:lang w:val="en-GB"/>
         </w:rPr>
-        <w:t xml:space="preserve">Navigate the video to a second clearly identifiable point and mark it with markE. </w:t>
+        <w:t xml:space="preserve">Navigate the video to a second clearly identifiable point and mark it with </w:t>
+      </w:r>
+      <w:proofErr w:type="spellStart"/>
+      <w:r>
+        <w:rPr>
+          <w:lang w:val="en-GB"/>
+        </w:rPr>
+        <w:t>markE</w:t>
+      </w:r>
+      <w:proofErr w:type="spellEnd"/>
+      <w:r>
+        <w:rPr>
+          <w:lang w:val="en-GB"/>
+        </w:rPr>
+        <w:t xml:space="preserve">. </w:t>
       </w:r>
     </w:p>
     <w:p>
@@ -8174,7 +9832,21 @@
         <w:rPr>
           <w:lang w:val="en-GB"/>
         </w:rPr>
-        <w:t xml:space="preserve">Find the corresponding point on the map and mark it with markE. </w:t>
+        <w:t xml:space="preserve">Find the corresponding point on the map and mark it with </w:t>
+      </w:r>
+      <w:proofErr w:type="spellStart"/>
+      <w:r>
+        <w:rPr>
+          <w:lang w:val="en-GB"/>
+        </w:rPr>
+        <w:t>markE</w:t>
+      </w:r>
+      <w:proofErr w:type="spellEnd"/>
+      <w:r>
+        <w:rPr>
+          <w:lang w:val="en-GB"/>
+        </w:rPr>
+        <w:t xml:space="preserve">. </w:t>
       </w:r>
     </w:p>
     <w:p>
@@ -8268,21 +9940,57 @@
           <w:lang w:val="en-GB"/>
         </w:rPr>
       </w:pPr>
-      <w:r>
-        <w:rPr>
-          <w:b/>
-          <w:bCs/>
-          <w:lang w:val="en-GB"/>
-        </w:rPr>
-        <w:t>GetElevation from  Mapbox</w:t>
-      </w:r>
-      <w:r>
-        <w:rPr>
-          <w:bCs/>
-          <w:lang w:val="en-GB"/>
-        </w:rPr>
-        <w:br/>
-        <w:t>Retrieves elevation data from Mapbox for the selected area and stores it.</w:t>
+      <w:proofErr w:type="spellStart"/>
+      <w:r>
+        <w:rPr>
+          <w:b/>
+          <w:bCs/>
+          <w:lang w:val="en-GB"/>
+        </w:rPr>
+        <w:t>GetElevation</w:t>
+      </w:r>
+      <w:proofErr w:type="spellEnd"/>
+      <w:r>
+        <w:rPr>
+          <w:b/>
+          <w:bCs/>
+          <w:lang w:val="en-GB"/>
+        </w:rPr>
+        <w:t xml:space="preserve"> from  </w:t>
+      </w:r>
+      <w:proofErr w:type="spellStart"/>
+      <w:r>
+        <w:rPr>
+          <w:b/>
+          <w:bCs/>
+          <w:lang w:val="en-GB"/>
+        </w:rPr>
+        <w:t>Mapbox</w:t>
+      </w:r>
+      <w:proofErr w:type="spellEnd"/>
+      <w:r>
+        <w:rPr>
+          <w:bCs/>
+          <w:lang w:val="en-GB"/>
+        </w:rPr>
+        <w:br/>
+        <w:t xml:space="preserve">Retrieves elevation data from </w:t>
+      </w:r>
+      <w:proofErr w:type="spellStart"/>
+      <w:r>
+        <w:rPr>
+          <w:bCs/>
+          <w:lang w:val="en-GB"/>
+        </w:rPr>
+        <w:t>Mapbox</w:t>
+      </w:r>
+      <w:proofErr w:type="spellEnd"/>
+      <w:r>
+        <w:rPr>
+          <w:bCs/>
+          <w:lang w:val="en-GB"/>
+        </w:rPr>
+        <w:t xml:space="preserve"> for the selected area and stores it.</w:t>
       </w:r>
       <w:r>
         <w:rPr>
@@ -8303,7 +10011,23 @@
           <w:bCs/>
           <w:lang w:val="en-GB"/>
         </w:rPr>
-        <w:t xml:space="preserve"> You need a Mapbox Key/Token</w:t>
+        <w:t xml:space="preserve"> You need a </w:t>
+      </w:r>
+      <w:proofErr w:type="spellStart"/>
+      <w:r>
+        <w:rPr>
+          <w:bCs/>
+          <w:lang w:val="en-GB"/>
+        </w:rPr>
+        <w:t>Mapbox</w:t>
+      </w:r>
+      <w:proofErr w:type="spellEnd"/>
+      <w:r>
+        <w:rPr>
+          <w:bCs/>
+          <w:lang w:val="en-GB"/>
+        </w:rPr>
+        <w:t xml:space="preserve"> Key/Token</w:t>
       </w:r>
       <w:r>
         <w:rPr>
@@ -8347,15 +10071,79 @@
           <w:bCs/>
           <w:lang w:val="en-GB"/>
         </w:rPr>
-        <w:t>Change the final height ( markE) in a selected area.</w:t>
-      </w:r>
-      <w:r>
-        <w:rPr>
-          <w:bCs/>
-          <w:lang w:val="en-GB"/>
-        </w:rPr>
-        <w:br/>
-        <w:t>We select an area, markB and markE, and now we can change the final height, markE.</w:t>
+        <w:t xml:space="preserve">Change the final height ( </w:t>
+      </w:r>
+      <w:proofErr w:type="spellStart"/>
+      <w:r>
+        <w:rPr>
+          <w:bCs/>
+          <w:lang w:val="en-GB"/>
+        </w:rPr>
+        <w:t>markE</w:t>
+      </w:r>
+      <w:proofErr w:type="spellEnd"/>
+      <w:r>
+        <w:rPr>
+          <w:bCs/>
+          <w:lang w:val="en-GB"/>
+        </w:rPr>
+        <w:t>) in a selected area.</w:t>
+      </w:r>
+      <w:r>
+        <w:rPr>
+          <w:bCs/>
+          <w:lang w:val="en-GB"/>
+        </w:rPr>
+        <w:br/>
+        <w:t xml:space="preserve">We select an area, </w:t>
+      </w:r>
+      <w:proofErr w:type="spellStart"/>
+      <w:r>
+        <w:rPr>
+          <w:bCs/>
+          <w:lang w:val="en-GB"/>
+        </w:rPr>
+        <w:t>markB</w:t>
+      </w:r>
+      <w:proofErr w:type="spellEnd"/>
+      <w:r>
+        <w:rPr>
+          <w:bCs/>
+          <w:lang w:val="en-GB"/>
+        </w:rPr>
+        <w:t xml:space="preserve"> and </w:t>
+      </w:r>
+      <w:proofErr w:type="spellStart"/>
+      <w:r>
+        <w:rPr>
+          <w:bCs/>
+          <w:lang w:val="en-GB"/>
+        </w:rPr>
+        <w:t>markE</w:t>
+      </w:r>
+      <w:proofErr w:type="spellEnd"/>
+      <w:r>
+        <w:rPr>
+          <w:bCs/>
+          <w:lang w:val="en-GB"/>
+        </w:rPr>
+        <w:t xml:space="preserve">, and now we can change the final height, </w:t>
+      </w:r>
+      <w:proofErr w:type="spellStart"/>
+      <w:r>
+        <w:rPr>
+          <w:bCs/>
+          <w:lang w:val="en-GB"/>
+        </w:rPr>
+        <w:t>markE</w:t>
+      </w:r>
+      <w:proofErr w:type="spellEnd"/>
+      <w:r>
+        <w:rPr>
+          <w:bCs/>
+          <w:lang w:val="en-GB"/>
+        </w:rPr>
+        <w:t>.</w:t>
       </w:r>
       <w:r>
         <w:rPr>
@@ -8422,7 +10210,23 @@
           <w:lang w:val="en-GB"/>
         </w:rPr>
         <w:br/>
-        <w:t>Please check after resample ( it is recommend to this first and that’s why we check it at every load of a gpx file)</w:t>
+        <w:t xml:space="preserve">Please check after resample ( it is recommend to this first and that’s why we check it at every load of a </w:t>
+      </w:r>
+      <w:proofErr w:type="spellStart"/>
+      <w:r>
+        <w:rPr>
+          <w:bCs/>
+          <w:lang w:val="en-GB"/>
+        </w:rPr>
+        <w:t>gpx</w:t>
+      </w:r>
+      <w:proofErr w:type="spellEnd"/>
+      <w:r>
+        <w:rPr>
+          <w:bCs/>
+          <w:lang w:val="en-GB"/>
+        </w:rPr>
+        <w:t xml:space="preserve"> file)</w:t>
       </w:r>
     </w:p>
     <w:p>
@@ -8497,6 +10301,7 @@
         </w:rPr>
         <w:t>Select the start of the problematic section with </w:t>
       </w:r>
+      <w:proofErr w:type="spellStart"/>
       <w:r>
         <w:rPr>
           <w:b/>
@@ -8505,6 +10310,7 @@
         </w:rPr>
         <w:t>MarkB</w:t>
       </w:r>
+      <w:proofErr w:type="spellEnd"/>
       <w:r>
         <w:rPr>
           <w:bCs/>
@@ -8512,6 +10318,7 @@
         </w:rPr>
         <w:t> and the end with </w:t>
       </w:r>
+      <w:proofErr w:type="spellStart"/>
       <w:r>
         <w:rPr>
           <w:b/>
@@ -8520,6 +10327,7 @@
         </w:rPr>
         <w:t>MarkE</w:t>
       </w:r>
+      <w:proofErr w:type="spellEnd"/>
       <w:r>
         <w:rPr>
           <w:bCs/>
@@ -8744,7 +10552,7 @@
       </w:pPr>
       <w:r>
         <w:pict w14:anchorId="72D86DEF">
-          <v:rect id="Rechteck 30" o:spid="_x0000_s1045" style="width:453.6pt;height:1.5pt;visibility:visible;mso-wrap-style:square;mso-left-percent:-10001;mso-top-percent:-10001;mso-position-horizontal:absolute;mso-position-horizontal-relative:char;mso-position-vertical:absolute;mso-position-vertical-relative:line;mso-left-percent:-10001;mso-top-percent:-10001;v-text-anchor:top" fillcolor="#a0a0a0" stroked="f" strokeweight="0">
+          <v:rect id="Rechteck 30" o:spid="_x0000_s1026" style="width:453.6pt;height:1.5pt;visibility:visible;mso-wrap-style:square;mso-left-percent:-10001;mso-top-percent:-10001;mso-position-horizontal:absolute;mso-position-horizontal-relative:char;mso-position-vertical:absolute;mso-position-vertical-relative:line;mso-left-percent:-10001;mso-top-percent:-10001;v-text-anchor:top" fillcolor="#a0a0a0" stroked="f" strokeweight="0">
             <w10:anchorlock/>
           </v:rect>
         </w:pict>
@@ -9065,7 +10873,21 @@
           <w:lang w:val="en-GB"/>
         </w:rPr>
         <w:br/>
-        <w:t xml:space="preserve">You get a information which is the deepest point and you can choose between: </w:t>
+        <w:t xml:space="preserve">You get </w:t>
+      </w:r>
+      <w:proofErr w:type="spellStart"/>
+      <w:r>
+        <w:rPr>
+          <w:lang w:val="en-GB"/>
+        </w:rPr>
+        <w:t>a</w:t>
+      </w:r>
+      <w:proofErr w:type="spellEnd"/>
+      <w:r>
+        <w:rPr>
+          <w:lang w:val="en-GB"/>
+        </w:rPr>
+        <w:t xml:space="preserve"> information which is the deepest point and you can choose between: </w:t>
       </w:r>
       <w:r>
         <w:rPr>
@@ -9079,7 +10901,21 @@
           <w:lang w:val="en-GB"/>
         </w:rPr>
         <w:br/>
-        <w:t>- Raise track above sea level – we move all points over the sea level with exact the shown</w:t>
+        <w:t xml:space="preserve">- Raise track above sea level – we move all points over the sea level with exact </w:t>
+      </w:r>
+      <w:proofErr w:type="spellStart"/>
+      <w:r>
+        <w:rPr>
+          <w:lang w:val="en-GB"/>
+        </w:rPr>
+        <w:t>the</w:t>
+      </w:r>
+      <w:proofErr w:type="spellEnd"/>
+      <w:r>
+        <w:rPr>
+          <w:lang w:val="en-GB"/>
+        </w:rPr>
+        <w:t xml:space="preserve"> shown</w:t>
       </w:r>
       <w:r>
         <w:rPr>
@@ -9125,7 +10961,35 @@
         <w:rPr>
           <w:lang w:val="en-GB"/>
         </w:rPr>
-        <w:t>this will show the ZeroSpeed Points and it’s a clear marker that you are stopping here and have 0km/h speed ( you can setup the value in the Setup Menu). This Points must be cutted!</w:t>
+        <w:t xml:space="preserve">this will show the </w:t>
+      </w:r>
+      <w:proofErr w:type="spellStart"/>
+      <w:r>
+        <w:rPr>
+          <w:lang w:val="en-GB"/>
+        </w:rPr>
+        <w:t>ZeroSpeed</w:t>
+      </w:r>
+      <w:proofErr w:type="spellEnd"/>
+      <w:r>
+        <w:rPr>
+          <w:lang w:val="en-GB"/>
+        </w:rPr>
+        <w:t xml:space="preserve"> Points and it’s a clear marker that you are stopping here and have 0km/h speed ( you can setup the value in the Setup Menu). This Points must be </w:t>
+      </w:r>
+      <w:proofErr w:type="spellStart"/>
+      <w:r>
+        <w:rPr>
+          <w:lang w:val="en-GB"/>
+        </w:rPr>
+        <w:t>cutted</w:t>
+      </w:r>
+      <w:proofErr w:type="spellEnd"/>
+      <w:r>
+        <w:rPr>
+          <w:lang w:val="en-GB"/>
+        </w:rPr>
+        <w:t>!</w:t>
       </w:r>
       <w:r>
         <w:rPr>
@@ -9138,7 +11002,49 @@
           <w:lang w:val="en-GB"/>
         </w:rPr>
         <w:lastRenderedPageBreak/>
-        <w:t>We don’t want ZeroSpeed Points. If you take a look at the info line directly under the buttons you can see how many ZeroSpeed or TimeGaps you have</w:t>
+        <w:t xml:space="preserve">We don’t want </w:t>
+      </w:r>
+      <w:proofErr w:type="spellStart"/>
+      <w:r>
+        <w:rPr>
+          <w:lang w:val="en-GB"/>
+        </w:rPr>
+        <w:t>ZeroSpeed</w:t>
+      </w:r>
+      <w:proofErr w:type="spellEnd"/>
+      <w:r>
+        <w:rPr>
+          <w:lang w:val="en-GB"/>
+        </w:rPr>
+        <w:t xml:space="preserve"> Points. If you take a look at the info line directly under the buttons you can see how many </w:t>
+      </w:r>
+      <w:proofErr w:type="spellStart"/>
+      <w:r>
+        <w:rPr>
+          <w:lang w:val="en-GB"/>
+        </w:rPr>
+        <w:t>ZeroSpeed</w:t>
+      </w:r>
+      <w:proofErr w:type="spellEnd"/>
+      <w:r>
+        <w:rPr>
+          <w:lang w:val="en-GB"/>
+        </w:rPr>
+        <w:t xml:space="preserve"> or </w:t>
+      </w:r>
+      <w:proofErr w:type="spellStart"/>
+      <w:r>
+        <w:rPr>
+          <w:lang w:val="en-GB"/>
+        </w:rPr>
+        <w:t>TimeGaps</w:t>
+      </w:r>
+      <w:proofErr w:type="spellEnd"/>
+      <w:r>
+        <w:rPr>
+          <w:lang w:val="en-GB"/>
+        </w:rPr>
+        <w:t xml:space="preserve"> you have</w:t>
       </w:r>
     </w:p>
     <w:p>
@@ -9153,13 +11059,23 @@
           <w:lang w:val="en-GB"/>
         </w:rPr>
       </w:pPr>
-      <w:r>
-        <w:rPr>
-          <w:b/>
-          <w:bCs/>
-          <w:lang w:val="en-GB"/>
-        </w:rPr>
-        <w:t>Yelllow Marker</w:t>
+      <w:proofErr w:type="spellStart"/>
+      <w:r>
+        <w:rPr>
+          <w:b/>
+          <w:bCs/>
+          <w:lang w:val="en-GB"/>
+        </w:rPr>
+        <w:t>Yelllow</w:t>
+      </w:r>
+      <w:proofErr w:type="spellEnd"/>
+      <w:r>
+        <w:rPr>
+          <w:b/>
+          <w:bCs/>
+          <w:lang w:val="en-GB"/>
+        </w:rPr>
+        <w:t xml:space="preserve"> Marker</w:t>
       </w:r>
       <w:r>
         <w:rPr>
@@ -9192,13 +11108,55 @@
         <w:rPr>
           <w:lang w:val="en-GB"/>
         </w:rPr>
-        <w:t xml:space="preserve">, because you was riding through a tunnel and lost the signal, than the first point after the tunnel have a TimeGaps. </w:t>
-      </w:r>
-      <w:r>
-        <w:rPr>
-          <w:lang w:val="en-GB"/>
-        </w:rPr>
-        <w:t xml:space="preserve">If yu play the Video at this point and your are moving and the point has a Speed value all is ok. </w:t>
+        <w:t xml:space="preserve">, because you was riding through a tunnel and lost the signal, than the first point after the tunnel have a </w:t>
+      </w:r>
+      <w:proofErr w:type="spellStart"/>
+      <w:r>
+        <w:rPr>
+          <w:lang w:val="en-GB"/>
+        </w:rPr>
+        <w:t>TimeGaps</w:t>
+      </w:r>
+      <w:proofErr w:type="spellEnd"/>
+      <w:r>
+        <w:rPr>
+          <w:lang w:val="en-GB"/>
+        </w:rPr>
+        <w:t xml:space="preserve">. </w:t>
+      </w:r>
+      <w:r>
+        <w:rPr>
+          <w:lang w:val="en-GB"/>
+        </w:rPr>
+        <w:t xml:space="preserve">If </w:t>
+      </w:r>
+      <w:proofErr w:type="spellStart"/>
+      <w:r>
+        <w:rPr>
+          <w:lang w:val="en-GB"/>
+        </w:rPr>
+        <w:t>yu</w:t>
+      </w:r>
+      <w:proofErr w:type="spellEnd"/>
+      <w:r>
+        <w:rPr>
+          <w:lang w:val="en-GB"/>
+        </w:rPr>
+        <w:t xml:space="preserve"> play the Video at this point and </w:t>
+      </w:r>
+      <w:proofErr w:type="spellStart"/>
+      <w:r>
+        <w:rPr>
+          <w:lang w:val="en-GB"/>
+        </w:rPr>
+        <w:t>your</w:t>
+      </w:r>
+      <w:proofErr w:type="spellEnd"/>
+      <w:r>
+        <w:rPr>
+          <w:lang w:val="en-GB"/>
+        </w:rPr>
+        <w:t xml:space="preserve"> are moving and the point has a Speed value all is ok. </w:t>
       </w:r>
       <w:r>
         <w:rPr>
@@ -9257,7 +11215,49 @@
         <w:rPr>
           <w:lang w:val="en-GB"/>
         </w:rPr>
-        <w:t>If you have uses the sync button and the first part of the gpx-list, this area is grayed too and this mean it will not be written to the exported gpx file, all red and yellow markers  are not shown in the info-list and you can ignore them. You see o sea level warning if a point is in the grey area and under sea level!</w:t>
+        <w:t xml:space="preserve">If you have uses the sync button and the first part of the </w:t>
+      </w:r>
+      <w:proofErr w:type="spellStart"/>
+      <w:r>
+        <w:rPr>
+          <w:lang w:val="en-GB"/>
+        </w:rPr>
+        <w:t>gpx</w:t>
+      </w:r>
+      <w:proofErr w:type="spellEnd"/>
+      <w:r>
+        <w:rPr>
+          <w:lang w:val="en-GB"/>
+        </w:rPr>
+        <w:t xml:space="preserve">-list, this area is </w:t>
+      </w:r>
+      <w:proofErr w:type="spellStart"/>
+      <w:r>
+        <w:rPr>
+          <w:lang w:val="en-GB"/>
+        </w:rPr>
+        <w:t>grayed</w:t>
+      </w:r>
+      <w:proofErr w:type="spellEnd"/>
+      <w:r>
+        <w:rPr>
+          <w:lang w:val="en-GB"/>
+        </w:rPr>
+        <w:t xml:space="preserve"> too and this mean it will not be written to the exported </w:t>
+      </w:r>
+      <w:proofErr w:type="spellStart"/>
+      <w:r>
+        <w:rPr>
+          <w:lang w:val="en-GB"/>
+        </w:rPr>
+        <w:t>gpx</w:t>
+      </w:r>
+      <w:proofErr w:type="spellEnd"/>
+      <w:r>
+        <w:rPr>
+          <w:lang w:val="en-GB"/>
+        </w:rPr>
+        <w:t xml:space="preserve"> file, all red and yellow markers  are not shown in the info-list and you can ignore them. You see o sea level warning if a point is in the grey area and under sea level!</w:t>
       </w:r>
       <w:r>
         <w:rPr>
@@ -9580,7 +11580,21 @@
         <w:rPr>
           <w:lang w:val="en-GB"/>
         </w:rPr>
-        <w:t>Blue Area: Marks a Overlay ( with right click into the blue Area you can delete the overlay)</w:t>
+        <w:t xml:space="preserve">Blue Area: Marks </w:t>
+      </w:r>
+      <w:proofErr w:type="spellStart"/>
+      <w:r>
+        <w:rPr>
+          <w:lang w:val="en-GB"/>
+        </w:rPr>
+        <w:t>a</w:t>
+      </w:r>
+      <w:proofErr w:type="spellEnd"/>
+      <w:r>
+        <w:rPr>
+          <w:lang w:val="en-GB"/>
+        </w:rPr>
+        <w:t xml:space="preserve"> Overlay ( with right click into the blue Area you can delete the overlay)</w:t>
       </w:r>
     </w:p>
     <w:p>
@@ -9912,7 +11926,21 @@
           <w:lang w:val="en-GB"/>
         </w:rPr>
         <w:br/>
-        <w:t>if you extract a GPX from a Gopro it will be loaded in Slot 2</w:t>
+        <w:t xml:space="preserve">if you extract a GPX from a </w:t>
+      </w:r>
+      <w:proofErr w:type="spellStart"/>
+      <w:r>
+        <w:rPr>
+          <w:lang w:val="en-GB"/>
+        </w:rPr>
+        <w:t>Gopro</w:t>
+      </w:r>
+      <w:proofErr w:type="spellEnd"/>
+      <w:r>
+        <w:rPr>
+          <w:lang w:val="en-GB"/>
+        </w:rPr>
+        <w:t xml:space="preserve"> it will be loaded in Slot 2</w:t>
       </w:r>
       <w:r>
         <w:rPr>
@@ -9926,14 +11954,70 @@
           <w:lang w:val="en-GB"/>
         </w:rPr>
         <w:br/>
-        <w:t>If you prefer to work with GPX from a Wahoo/Garmin/Strava/whatever ( what I recommended) you can worl like before.</w:t>
-      </w:r>
-      <w:r>
-        <w:rPr>
-          <w:lang w:val="en-GB"/>
-        </w:rPr>
-        <w:br/>
-        <w:t>but if you only have a Gopro with GPS, you had in the back to extract the gpx with a extern tool to load it into the App, now ypu can do it directly in the App</w:t>
+        <w:t xml:space="preserve">If you prefer to work with GPX from a Wahoo/Garmin/Strava/whatever ( what I recommended) you can </w:t>
+      </w:r>
+      <w:proofErr w:type="spellStart"/>
+      <w:r>
+        <w:rPr>
+          <w:lang w:val="en-GB"/>
+        </w:rPr>
+        <w:t>worl</w:t>
+      </w:r>
+      <w:proofErr w:type="spellEnd"/>
+      <w:r>
+        <w:rPr>
+          <w:lang w:val="en-GB"/>
+        </w:rPr>
+        <w:t xml:space="preserve"> like before.</w:t>
+      </w:r>
+      <w:r>
+        <w:rPr>
+          <w:lang w:val="en-GB"/>
+        </w:rPr>
+        <w:br/>
+        <w:t xml:space="preserve">but if you only have a </w:t>
+      </w:r>
+      <w:proofErr w:type="spellStart"/>
+      <w:r>
+        <w:rPr>
+          <w:lang w:val="en-GB"/>
+        </w:rPr>
+        <w:t>Gopro</w:t>
+      </w:r>
+      <w:proofErr w:type="spellEnd"/>
+      <w:r>
+        <w:rPr>
+          <w:lang w:val="en-GB"/>
+        </w:rPr>
+        <w:t xml:space="preserve"> with GPS, you had in the back to extract the </w:t>
+      </w:r>
+      <w:proofErr w:type="spellStart"/>
+      <w:r>
+        <w:rPr>
+          <w:lang w:val="en-GB"/>
+        </w:rPr>
+        <w:t>gpx</w:t>
+      </w:r>
+      <w:proofErr w:type="spellEnd"/>
+      <w:r>
+        <w:rPr>
+          <w:lang w:val="en-GB"/>
+        </w:rPr>
+        <w:t xml:space="preserve"> with a extern tool to load it into the App, now </w:t>
+      </w:r>
+      <w:proofErr w:type="spellStart"/>
+      <w:r>
+        <w:rPr>
+          <w:lang w:val="en-GB"/>
+        </w:rPr>
+        <w:t>ypu</w:t>
+      </w:r>
+      <w:proofErr w:type="spellEnd"/>
+      <w:r>
+        <w:rPr>
+          <w:lang w:val="en-GB"/>
+        </w:rPr>
+        <w:t xml:space="preserve"> can do it directly in the App</w:t>
       </w:r>
       <w:r>
         <w:rPr>
@@ -9968,7 +12052,20 @@
           <w:lang w:val="en-GB"/>
         </w:rPr>
         <w:br/>
-        <w:t>Gopro-GPX are always perfect synced to the Video!</w:t>
+      </w:r>
+      <w:proofErr w:type="spellStart"/>
+      <w:r>
+        <w:rPr>
+          <w:lang w:val="en-GB"/>
+        </w:rPr>
+        <w:t>Gopro</w:t>
+      </w:r>
+      <w:proofErr w:type="spellEnd"/>
+      <w:r>
+        <w:rPr>
+          <w:lang w:val="en-GB"/>
+        </w:rPr>
+        <w:t>-GPX are always perfect synced to the Video!</w:t>
       </w:r>
       <w:r>
         <w:rPr>
@@ -9982,7 +12079,21 @@
           <w:lang w:val="en-GB"/>
         </w:rPr>
         <w:br/>
-        <w:t>If you have a Gopro File with GPX and want sync your extern GPX loaded in Slot 1:</w:t>
+        <w:t xml:space="preserve">If you have a </w:t>
+      </w:r>
+      <w:proofErr w:type="spellStart"/>
+      <w:r>
+        <w:rPr>
+          <w:lang w:val="en-GB"/>
+        </w:rPr>
+        <w:t>Gopro</w:t>
+      </w:r>
+      <w:proofErr w:type="spellEnd"/>
+      <w:r>
+        <w:rPr>
+          <w:lang w:val="en-GB"/>
+        </w:rPr>
+        <w:t xml:space="preserve"> File with GPX and want sync your extern GPX loaded in Slot 1:</w:t>
       </w:r>
       <w:r>
         <w:rPr>
@@ -10124,7 +12235,7 @@
           <w:lang w:val="en-GB"/>
         </w:rPr>
         <w:br/>
-        <w:t>Sometimes there are some meters difference, than you can simple move the Video a lttle bit</w:t>
+        <w:t xml:space="preserve">Sometimes there are some meters difference, than you can simple move the Video a </w:t>
       </w:r>
       <w:r>
         <w:rPr>
@@ -10132,112 +12243,100 @@
           <w:iCs/>
           <w:lang w:val="en-GB"/>
         </w:rPr>
-        <w:br/>
-        <w:t>forward or backward to the point we shown ( only some 1x frames cklick) and it will match</w:t>
-      </w:r>
-      <w:r>
-        <w:rPr>
-          <w:lang w:val="en-GB"/>
-        </w:rPr>
-        <w:t xml:space="preserve"> </w:t>
-      </w:r>
-      <w:r>
-        <w:rPr>
-          <w:lang w:val="en-GB"/>
-        </w:rPr>
-        <w:br/>
-      </w:r>
-    </w:p>
-    <w:p>
-      <w:pPr>
-        <w:rPr>
-          <w:b/>
+        <w:t>little</w:t>
+      </w:r>
+      <w:r>
+        <w:rPr>
           <w:i/>
           <w:iCs/>
-          <w:sz w:val="32"/>
-          <w:szCs w:val="32"/>
-          <w:lang w:val="en-GB"/>
-        </w:rPr>
-      </w:pPr>
-      <w:r>
-        <w:rPr>
-          <w:lang w:val="en-GB"/>
-        </w:rPr>
-        <w:br/>
-      </w:r>
-      <w:r>
-        <w:rPr>
-          <w:b/>
+          <w:lang w:val="en-GB"/>
+        </w:rPr>
+        <w:t xml:space="preserve"> bit</w:t>
+      </w:r>
+      <w:r>
+        <w:rPr>
           <w:i/>
           <w:iCs/>
-          <w:sz w:val="32"/>
-          <w:szCs w:val="32"/>
-          <w:lang w:val="en-GB"/>
-        </w:rPr>
-        <w:t>Youtube-Tutorials:</w:t>
-      </w:r>
-    </w:p>
-    <w:p>
-      <w:pPr>
-        <w:rPr>
-          <w:lang w:val="en-GB"/>
-        </w:rPr>
-      </w:pPr>
-      <w:r>
-        <w:rPr>
-          <w:b/>
-          <w:bCs/>
-          <w:sz w:val="32"/>
-          <w:szCs w:val="32"/>
-          <w:lang w:val="en-GB"/>
-        </w:rPr>
-        <w:t>https://www.youtube.com/@</w:t>
-      </w:r>
-      <w:r>
-        <w:rPr>
-          <w:b/>
-          <w:bCs/>
-          <w:sz w:val="32"/>
-          <w:szCs w:val="32"/>
-          <w:lang w:val="en-GB"/>
-        </w:rPr>
-        <w:t>VGSync</w:t>
-      </w:r>
-    </w:p>
-    <w:p>
-      <w:pPr>
-        <w:rPr>
-          <w:lang w:val="en-GB"/>
-        </w:rPr>
-      </w:pPr>
-    </w:p>
-    <w:p>
-      <w:pPr>
-        <w:rPr>
-          <w:lang w:val="en-GB"/>
-        </w:rPr>
-      </w:pPr>
-    </w:p>
-    <w:p>
-      <w:pPr>
-        <w:rPr>
-          <w:lang w:val="en-GB"/>
-        </w:rPr>
-      </w:pPr>
-    </w:p>
-    <w:p>
-      <w:pPr>
-        <w:rPr>
-          <w:b/>
-          <w:bCs/>
-          <w:lang w:val="en-GB"/>
-        </w:rPr>
-      </w:pPr>
-      <w:r>
-        <w:rPr>
-          <w:lang w:val="en-GB"/>
-        </w:rPr>
-        <w:t>© Bernd Eller – 2025 – All rights reserved.</w:t>
+          <w:lang w:val="en-GB"/>
+        </w:rPr>
+        <w:br/>
+        <w:t xml:space="preserve">forward or backward to the point we shown ( only some 1x frames </w:t>
+      </w:r>
+      <w:r>
+        <w:rPr>
+          <w:i/>
+          <w:iCs/>
+          <w:lang w:val="en-GB"/>
+        </w:rPr>
+        <w:t>click</w:t>
+      </w:r>
+      <w:r>
+        <w:rPr>
+          <w:i/>
+          <w:iCs/>
+          <w:lang w:val="en-GB"/>
+        </w:rPr>
+        <w:t>) and it will match</w:t>
+      </w:r>
+      <w:r>
+        <w:rPr>
+          <w:lang w:val="en-GB"/>
+        </w:rPr>
+        <w:t xml:space="preserve"> </w:t>
+      </w:r>
+      <w:r>
+        <w:rPr>
+          <w:lang w:val="en-GB"/>
+        </w:rPr>
+        <w:br/>
+      </w:r>
+    </w:p>
+    <w:p>
+      <w:pPr>
+        <w:rPr>
+          <w:lang w:val="en-GB"/>
+        </w:rPr>
+      </w:pPr>
+    </w:p>
+    <w:p>
+      <w:pPr>
+        <w:rPr>
+          <w:lang w:val="en-GB"/>
+        </w:rPr>
+      </w:pPr>
+    </w:p>
+    <w:p>
+      <w:r>
+        <w:rPr>
+          <w:lang w:val="en-GB"/>
+        </w:rPr>
+        <w:t xml:space="preserve">© </w:t>
+      </w:r>
+      <w:proofErr w:type="spellStart"/>
+      <w:r>
+        <w:rPr>
+          <w:lang w:val="en-GB"/>
+        </w:rPr>
+        <w:t>Kinomap</w:t>
+      </w:r>
+      <w:proofErr w:type="spellEnd"/>
+      <w:r>
+        <w:rPr>
+          <w:lang w:val="en-GB"/>
+        </w:rPr>
+        <w:t xml:space="preserve"> – 202</w:t>
+      </w:r>
+      <w:r>
+        <w:rPr>
+          <w:lang w:val="en-GB"/>
+        </w:rPr>
+        <w:t>6</w:t>
+      </w:r>
+      <w:r>
+        <w:rPr>
+          <w:lang w:val="en-GB"/>
+        </w:rPr>
+        <w:t xml:space="preserve"> – All rights reserved.</w:t>
       </w:r>
       <w:r>
         <w:rPr>
@@ -10264,21 +12363,7 @@
             <w:rStyle w:val="Lienhypertexte"/>
             <w:lang w:val="en-GB"/>
           </w:rPr>
-          <w:t>bernd@</w:t>
-        </w:r>
-        <w:r>
-          <w:rPr>
-            <w:rStyle w:val="Lienhypertexte"/>
-            <w:lang w:val="en-GB"/>
-          </w:rPr>
-          <w:t>VGSync</w:t>
-        </w:r>
-        <w:r>
-          <w:rPr>
-            <w:rStyle w:val="Lienhypertexte"/>
-            <w:lang w:val="en-GB"/>
-          </w:rPr>
-          <w:t>.com</w:t>
+          <w:t>d.prikhodko@kinomap.net</w:t>
         </w:r>
       </w:hyperlink>
       <w:r>
@@ -10292,29 +12377,27 @@
           <w:lang w:val="en-GB"/>
         </w:rPr>
         <w:br/>
-        <w:t xml:space="preserve">Web:  </w:t>
+      </w:r>
+      <w:proofErr w:type="spellStart"/>
+      <w:r>
+        <w:rPr>
+          <w:lang w:val="en-GB"/>
+        </w:rPr>
+        <w:t>Github</w:t>
+      </w:r>
+      <w:proofErr w:type="spellEnd"/>
+      <w:r>
+        <w:rPr>
+          <w:lang w:val="en-GB"/>
+        </w:rPr>
+        <w:t xml:space="preserve">: </w:t>
       </w:r>
       <w:hyperlink r:id="rId24" w:history="1">
         <w:r>
           <w:rPr>
             <w:rStyle w:val="Lienhypertexte"/>
-            <w:lang w:val="en-GB"/>
           </w:rPr>
-          <w:t>http://</w:t>
-        </w:r>
-        <w:r>
-          <w:rPr>
-            <w:rStyle w:val="Lienhypertexte"/>
-            <w:lang w:val="en-GB"/>
-          </w:rPr>
-          <w:t>VGSync</w:t>
-        </w:r>
-        <w:r>
-          <w:rPr>
-            <w:rStyle w:val="Lienhypertexte"/>
-            <w:lang w:val="en-GB"/>
-          </w:rPr>
-          <w:t>.com</w:t>
+          <w:t>https://github.com/dprh-kinomap/VGSync</w:t>
         </w:r>
       </w:hyperlink>
       <w:r>
@@ -10322,35 +12405,6 @@
           <w:lang w:val="en-GB"/>
         </w:rPr>
         <w:br/>
-        <w:t xml:space="preserve">Github: </w:t>
-      </w:r>
-      <w:hyperlink r:id="rId25" w:history="1">
-        <w:r>
-          <w:rPr>
-            <w:rStyle w:val="Lienhypertexte"/>
-            <w:lang w:val="en-GB"/>
-          </w:rPr>
-          <w:t>https://github.com/ridewithoutstomach/</w:t>
-        </w:r>
-        <w:r>
-          <w:rPr>
-            <w:rStyle w:val="Lienhypertexte"/>
-            <w:lang w:val="en-GB"/>
-          </w:rPr>
-          <w:t>VGSync</w:t>
-        </w:r>
-      </w:hyperlink>
-      <w:r>
-        <w:rPr>
-          <w:lang w:val="en-GB"/>
-        </w:rPr>
-        <w:br/>
-      </w:r>
-      <w:r>
-        <w:rPr>
-          <w:lang w:val="en-GB"/>
-        </w:rPr>
-        <w:br/>
       </w:r>
       <w:r>
         <w:rPr>
@@ -10373,17 +12427,47 @@
           <w:lang w:val="en-GB"/>
         </w:rPr>
       </w:pPr>
+      <w:proofErr w:type="spellStart"/>
       <w:r>
         <w:rPr>
           <w:lang w:val="en-GB"/>
         </w:rPr>
         <w:t>VGSync</w:t>
       </w:r>
-      <w:r>
-        <w:rPr>
-          <w:lang w:val="en-GB"/>
-        </w:rPr>
-        <w:t xml:space="preserve"> is an independent open-source project officially supported by Kinomap. “Kinomap” is a trademark or registered trademark of its owner and is used here with permission. Other brands mentioned (e.g., “Mapillary”) are trademarks of their respective owners; no affiliation or endorsement by them is implied.</w:t>
+      <w:proofErr w:type="spellEnd"/>
+      <w:r>
+        <w:rPr>
+          <w:lang w:val="en-GB"/>
+        </w:rPr>
+        <w:t xml:space="preserve"> is an independent open-source project officially supported by </w:t>
+      </w:r>
+      <w:proofErr w:type="spellStart"/>
+      <w:r>
+        <w:rPr>
+          <w:lang w:val="en-GB"/>
+        </w:rPr>
+        <w:t>Kinomap</w:t>
+      </w:r>
+      <w:proofErr w:type="spellEnd"/>
+      <w:r>
+        <w:rPr>
+          <w:lang w:val="en-GB"/>
+        </w:rPr>
+        <w:t>. “</w:t>
+      </w:r>
+      <w:proofErr w:type="spellStart"/>
+      <w:r>
+        <w:rPr>
+          <w:lang w:val="en-GB"/>
+        </w:rPr>
+        <w:t>Kinomap</w:t>
+      </w:r>
+      <w:proofErr w:type="spellEnd"/>
+      <w:r>
+        <w:rPr>
+          <w:lang w:val="en-GB"/>
+        </w:rPr>
+        <w:t>” is a trademark or registered trademark of its owner and is used here with permission. Other brands mentioned are trademarks of their respective owners; no affiliation or endorsement by them is implied.</w:t>
       </w:r>
     </w:p>
     <w:p>

</xml_diff>